<commit_message>
Docs and GDD v2.1 for the new night 5, tokens and peek rooms
Co-Authored-By: Claude Opus 5.5 <noreply@anthropic.com>
</commit_message>
<xml_diff>
--- a/docs/Show-Me-Your-ID-GDD.docx
+++ b/docs/Show-Me-Your-ID-GDD.docx
@@ -68,7 +68,7 @@
           <w:sz w:val="24"/>
           <w:szCs w:val="24"/>
         </w:rPr>
-        <w:t xml:space="preserve">Version 2.0</w:t>
+        <w:t xml:space="preserve">Version 2.1</w:t>
       </w:r>
     </w:p>
     <w:p>
@@ -806,7 +806,7 @@
         <w:rPr>
           <w:rFonts w:ascii="Calibri" w:cs="Calibri" w:eastAsia="Calibri" w:hAnsi="Calibri"/>
         </w:rPr>
-        <w:t xml:space="preserve">Version 2.0 of this document was rewritten so that every rule, number and control matches the game as it is built today. Where a feature is not finished it is listed in section 2.19 instead of being described as done.</w:t>
+        <w:t xml:space="preserve">Version 2 of this document was rewritten so that every rule, number and control matches the game as it is built today. Where a feature is not finished it is listed in section 2.19 instead of being described as done.</w:t>
       </w:r>
     </w:p>
     <w:p>
@@ -906,7 +906,7 @@
         <w:rPr>
           <w:rFonts w:ascii="Calibri" w:cs="Calibri" w:eastAsia="Calibri" w:hAnsi="Calibri"/>
         </w:rPr>
-        <w:t xml:space="preserve">2.0</w:t>
+        <w:t xml:space="preserve">2.1</w:t>
       </w:r>
     </w:p>
     <w:p>
@@ -1252,6 +1252,95 @@
           </w:p>
         </w:tc>
       </w:tr>
+      <w:tr>
+        <w:tc>
+          <w:tcPr>
+            <w:tcW w:type="dxa" w:w="1400"/>
+            <w:tcBorders>
+              <w:top w:val="single" w:color="808080" w:sz="4"/>
+              <w:left w:val="single" w:color="808080" w:sz="4"/>
+              <w:bottom w:val="single" w:color="808080" w:sz="4"/>
+              <w:right w:val="single" w:color="808080" w:sz="4"/>
+            </w:tcBorders>
+            <w:tcMar>
+              <w:top w:type="dxa" w:w="60"/>
+              <w:left w:type="dxa" w:w="100"/>
+              <w:bottom w:type="dxa" w:w="60"/>
+              <w:right w:type="dxa" w:w="100"/>
+            </w:tcMar>
+          </w:tcPr>
+          <w:p>
+            <w:r>
+              <w:rPr>
+                <w:rFonts w:ascii="Calibri" w:cs="Calibri" w:eastAsia="Calibri" w:hAnsi="Calibri"/>
+                <w:b w:val="false"/>
+                <w:bCs w:val="false"/>
+                <w:sz w:val="20"/>
+                <w:szCs w:val="20"/>
+              </w:rPr>
+              <w:t xml:space="preserve">2.1</w:t>
+            </w:r>
+          </w:p>
+        </w:tc>
+        <w:tc>
+          <w:tcPr>
+            <w:tcW w:type="dxa" w:w="1900"/>
+            <w:tcBorders>
+              <w:top w:val="single" w:color="808080" w:sz="4"/>
+              <w:left w:val="single" w:color="808080" w:sz="4"/>
+              <w:bottom w:val="single" w:color="808080" w:sz="4"/>
+              <w:right w:val="single" w:color="808080" w:sz="4"/>
+            </w:tcBorders>
+            <w:tcMar>
+              <w:top w:type="dxa" w:w="60"/>
+              <w:left w:type="dxa" w:w="100"/>
+              <w:bottom w:type="dxa" w:w="60"/>
+              <w:right w:type="dxa" w:w="100"/>
+            </w:tcMar>
+          </w:tcPr>
+          <w:p>
+            <w:r>
+              <w:rPr>
+                <w:rFonts w:ascii="Calibri" w:cs="Calibri" w:eastAsia="Calibri" w:hAnsi="Calibri"/>
+                <w:b w:val="false"/>
+                <w:bCs w:val="false"/>
+                <w:sz w:val="20"/>
+                <w:szCs w:val="20"/>
+              </w:rPr>
+              <w:t xml:space="preserve">October 31, 2026</w:t>
+            </w:r>
+          </w:p>
+        </w:tc>
+        <w:tc>
+          <w:tcPr>
+            <w:tcW w:type="dxa" w:w="6060"/>
+            <w:tcBorders>
+              <w:top w:val="single" w:color="808080" w:sz="4"/>
+              <w:left w:val="single" w:color="808080" w:sz="4"/>
+              <w:bottom w:val="single" w:color="808080" w:sz="4"/>
+              <w:right w:val="single" w:color="808080" w:sz="4"/>
+            </w:tcBorders>
+            <w:tcMar>
+              <w:top w:type="dxa" w:w="60"/>
+              <w:left w:type="dxa" w:w="100"/>
+              <w:bottom w:type="dxa" w:w="60"/>
+              <w:right w:type="dxa" w:w="100"/>
+            </w:tcMar>
+          </w:tcPr>
+          <w:p>
+            <w:r>
+              <w:rPr>
+                <w:rFonts w:ascii="Calibri" w:cs="Calibri" w:eastAsia="Calibri" w:hAnsi="Calibri"/>
+                <w:b w:val="false"/>
+                <w:bCs w:val="false"/>
+                <w:sz w:val="20"/>
+                <w:szCs w:val="20"/>
+              </w:rPr>
+              <w:t xml:space="preserve">Night 5 redesigned after the Nightmare Fredbear night of FNaF 4: only the administrator, survive until dawn. Interrogation without the student questions. Comfort room became a peek, the lit hallway was removed, tokens moved to the main menu, a night opening sequence and a how to play card were added.</w:t>
+            </w:r>
+          </w:p>
+        </w:tc>
+      </w:tr>
     </w:tbl>
     <w:p>
       <w:pPr>
@@ -1580,7 +1669,7 @@
         <w:rPr>
           <w:rFonts w:ascii="Calibri" w:cs="Calibri" w:eastAsia="Calibri" w:hAnsi="Calibri"/>
         </w:rPr>
-        <w:t xml:space="preserve">Five nights with 4, 6, 7, 8 and 8 visitors, a final night with a district administrator, the security desk, a hallway, two classrooms and a comfort room, ten findings that lead to a secret ending, and three endings (Win, Lose, Secret).</w:t>
+        <w:t xml:space="preserve">Five nights with 4, 6, 7 and 8 visitors and a final night with only a district administrator, the security desk, a hallway, two classrooms and a comfort room, ten findings that lead to a secret ending, and three endings (Win, Lose, Secret).</w:t>
       </w:r>
     </w:p>
     <w:p>
@@ -1803,7 +1892,7 @@
         <w:rPr>
           <w:rFonts w:ascii="Calibri" w:cs="Calibri" w:eastAsia="Calibri" w:hAnsi="Calibri"/>
         </w:rPr>
-        <w:t xml:space="preserve">Five nights of rising difficulty. On the last night the administrator arrives, is turned away, and is hunted through the school.</w:t>
+        <w:t xml:space="preserve">Five nights of rising difficulty. The last night is only the district administrator: interrogate him, refuse him, then survive him until dawn.</w:t>
       </w:r>
     </w:p>
     <w:p>
@@ -1819,7 +1908,7 @@
         <w:rPr>
           <w:rFonts w:ascii="Calibri" w:cs="Calibri" w:eastAsia="Calibri" w:hAnsi="Calibri"/>
         </w:rPr>
-        <w:t xml:space="preserve">A painted hallway whose art changes with the lights, two classrooms inspected by peeking with a cursor lamp, and a very dark walkable comfort room.</w:t>
+        <w:t xml:space="preserve">A painted hallway lit only by the flashlight, and two classrooms and a comfort room inspected by peeking with a cursor lamp.</w:t>
       </w:r>
     </w:p>
     <w:p>
@@ -1835,7 +1924,7 @@
         <w:rPr>
           <w:rFonts w:ascii="Calibri" w:cs="Calibri" w:eastAsia="Calibri" w:hAnsi="Calibri"/>
         </w:rPr>
-        <w:t xml:space="preserve">Ten clues, found in order, that open the secret ending. Endless and Challenge modes for score runs.</w:t>
+        <w:t xml:space="preserve">Ten clues, found in order, that open the secret ending. Tokens banked between runs unlock Endless and Challenge on the main menu.</w:t>
       </w:r>
     </w:p>
     <w:p>
@@ -1912,7 +2001,7 @@
         <w:rPr>
           <w:rFonts w:ascii="Calibri" w:cs="Calibri" w:eastAsia="Calibri" w:hAnsi="Calibri"/>
         </w:rPr>
-        <w:t xml:space="preserve">The desk is fixed; the classrooms are peek only, so the hallway is the only place the player can be caught.</w:t>
+        <w:t xml:space="preserve">The desk is fixed; the classrooms and the comfort room are peek only, so the hallway is the place the player walks and gets caught.</w:t>
       </w:r>
     </w:p>
     <w:p>
@@ -1997,7 +2086,7 @@
         <w:rPr>
           <w:rFonts w:ascii="Calibri" w:cs="Calibri" w:eastAsia="Calibri" w:hAnsi="Calibri"/>
         </w:rPr>
-        <w:t xml:space="preserve">Complete all five nights, drive the administrator off, and finish with fewer than three false rejections and fewer than three breaches.</w:t>
+        <w:t xml:space="preserve">Complete all five nights, survive the administrator until dawn, and finish with fewer than three false rejections and fewer than three breaches.</w:t>
       </w:r>
     </w:p>
     <w:p>
@@ -2021,7 +2110,7 @@
         <w:rPr>
           <w:rFonts w:ascii="Calibri" w:cs="Calibri" w:eastAsia="Calibri" w:hAnsi="Calibri"/>
         </w:rPr>
-        <w:t xml:space="preserve">Three breaches, three false rejections, the administrator let in, the administrator reaching the server door, or sanity reaching zero on the final night.</w:t>
+        <w:t xml:space="preserve">Three breaches, three false rejections, the administrator let in, the administrator catching the player three times, or sanity reaching zero on the final night.</w:t>
       </w:r>
     </w:p>
     <w:p>
@@ -2045,7 +2134,7 @@
         <w:rPr>
           <w:rFonts w:ascii="Calibri" w:cs="Calibri" w:eastAsia="Calibri" w:hAnsi="Calibri"/>
         </w:rPr>
-        <w:t xml:space="preserve">Find all ten clues in the right order, and drive the administrator off.</w:t>
+        <w:t xml:space="preserve">Find all ten clues in the right order, and survive until dawn.</w:t>
       </w:r>
     </w:p>
     <w:p>
@@ -2305,7 +2394,7 @@
                 <w:sz w:val="20"/>
                 <w:szCs w:val="20"/>
               </w:rPr>
-              <w:t xml:space="preserve">Fixed point and click desk (security room), 2D side scrolling hallway, peek view with a lamp cursor (classrooms), walkable comfort room</w:t>
+              <w:t xml:space="preserve">Fixed point and click desk (security room), 2D side scrolling hallway, peek view with a lamp cursor (classrooms and comfort room)</w:t>
             </w:r>
           </w:p>
         </w:tc>
@@ -3108,7 +3197,7 @@
         <w:rPr>
           <w:rFonts w:ascii="Calibri" w:cs="Calibri" w:eastAsia="Calibri" w:hAnsi="Calibri"/>
         </w:rPr>
-        <w:t xml:space="preserve">New Game shows the night intro, then a sticky note ("Click to begin") on the desk.</w:t>
+        <w:t xml:space="preserve">New Game opens on black: the night title fades in and out, the dialogue box opens and fades, and the black lifts off the shut booth. A sticky note waits on the desk; on night 1 it is the how to play card.</w:t>
       </w:r>
     </w:p>
     <w:p>
@@ -3140,7 +3229,7 @@
         <w:rPr>
           <w:rFonts w:ascii="Calibri" w:cs="Calibri" w:eastAsia="Calibri" w:hAnsi="Calibri"/>
         </w:rPr>
-        <w:t xml:space="preserve">At the window the player checks the ID and slip, asks up to two questions, opens the file, stamps, and hands the ID back.</w:t>
+        <w:t xml:space="preserve">The shutter opens when a visitor arrives. The player checks the ID and slip, asks up to two questions, opens the file, stamps, and hands the ID back.</w:t>
       </w:r>
     </w:p>
     <w:p>
@@ -3172,7 +3261,7 @@
         <w:rPr>
           <w:rFonts w:ascii="Calibri" w:cs="Calibri" w:eastAsia="Calibri" w:hAnsi="Calibri"/>
         </w:rPr>
-        <w:t xml:space="preserve">Nights 1 to 5 have 4, 6, 7, 8 and 8 visitors, plus the district administrator on night 5.</w:t>
+        <w:t xml:space="preserve">Nights 1 to 4 have 4, 6, 7 and 8 visitors. Night 5 has only the district administrator.</w:t>
       </w:r>
     </w:p>
     <w:p>
@@ -3188,7 +3277,7 @@
         <w:rPr>
           <w:rFonts w:ascii="Calibri" w:cs="Calibri" w:eastAsia="Calibri" w:hAnsi="Calibri"/>
         </w:rPr>
-        <w:t xml:space="preserve">After each night a results screen shows the decisions. After night 5 and the administrator hunt, the ending is decided.</w:t>
+        <w:t xml:space="preserve">After each night a results screen shows the decisions. After dawn on night 5, the ending is decided.</w:t>
       </w:r>
     </w:p>
     <w:p>
@@ -3281,7 +3370,7 @@
         <w:rPr>
           <w:rFonts w:ascii="Calibri" w:cs="Calibri" w:eastAsia="Calibri" w:hAnsi="Calibri"/>
         </w:rPr>
-        <w:t xml:space="preserve">Winning: five nights, the administrator driven off, and fewer than three of each mistake.</w:t>
+        <w:t xml:space="preserve">Winning: five nights, dawn on the last one, and fewer than three of each mistake.</w:t>
       </w:r>
     </w:p>
     <w:p>
@@ -4866,7 +4955,7 @@
         <w:rPr>
           <w:rFonts w:ascii="Calibri" w:cs="Calibri" w:eastAsia="Calibri" w:hAnsi="Calibri"/>
         </w:rPr>
-        <w:t xml:space="preserve">Classroom 1 and Classroom 2 are not entered. From the doorway the player moves a lamp cursor (F toggles it, Q switches wide or tight) that cuts a hole in the darkness, reveals clues and anomalies, and shows the room behind. The exit is the bottom edge or E at the doorway.</w:t>
+        <w:t xml:space="preserve">Classroom 1, Classroom 2 and the comfort room are not entered. From the doorway the player moves a lamp cursor (F toggles it, Q switches wide or tight) that cuts a hole in the darkness, reveals clues and anomalies, and shows the room behind. The exit is the bottom edge or E at the doorway.</w:t>
       </w:r>
     </w:p>
     <w:p>
@@ -4890,7 +4979,7 @@
         <w:rPr>
           <w:rFonts w:ascii="Calibri" w:cs="Calibri" w:eastAsia="Calibri" w:hAnsi="Calibri"/>
         </w:rPr>
-        <w:t xml:space="preserve">A door at the east end of the hallway, next to the sealed server door. Press E to go in and E at its door to leave. It is a room the player walks into, and it is dimmed far more than any other, so only the flashlight shows anything.</w:t>
+        <w:t xml:space="preserve">A door at the east end of the hallway, next to the sealed server door, peeked into like the classrooms.</w:t>
       </w:r>
     </w:p>
     <w:p>
@@ -4908,47 +4997,13 @@
           <w:b/>
           <w:bCs/>
         </w:rPr>
-        <w:t xml:space="preserve">Clues: </w:t>
-      </w:r>
-      <w:r>
-        <w:rPr>
-          <w:rFonts w:ascii="Calibri" w:cs="Calibri" w:eastAsia="Calibri" w:hAnsi="Calibri"/>
-        </w:rPr>
-        <w:t xml:space="preserve">Ten clues in three areas (section 2.11). Inspecting one shows a close up picture beside its text.</w:t>
-      </w:r>
-    </w:p>
-    <w:p>
-      <w:pPr>
-        <w:pStyle w:val="Heading2"/>
-        <w:spacing w:after="120" w:before="240"/>
-      </w:pPr>
-      <w:r>
-        <w:rPr>
-          <w:rFonts w:ascii="Calibri" w:cs="Calibri" w:eastAsia="Calibri" w:hAnsi="Calibri"/>
-        </w:rPr>
-        <w:t xml:space="preserve">Night 5: the administrator and the hunt</w:t>
-      </w:r>
-    </w:p>
-    <w:p>
-      <w:pPr>
-        <w:spacing w:after="120"/>
-      </w:pPr>
-      <w:r>
-        <w:rPr>
-          <w:rFonts w:ascii="Calibri" w:cs="Calibri" w:eastAsia="Calibri" w:hAnsi="Calibri"/>
-        </w:rPr>
-        <w:t xml:space="preserve">On the last night the district administrator arrives with a staff badge and a roster memo that do not match. The player may talk to him (T) with a short list of questions about the badge name, the badge number, his face, his answer to the classroom question, and any evidence found. Talking never stamps. REFUSE ENTRY is the same as a DECLINE stamp. Allowing him in loses the game at once.</w:t>
-      </w:r>
-    </w:p>
-    <w:p>
-      <w:pPr>
-        <w:spacing w:after="120"/>
-      </w:pPr>
-      <w:r>
-        <w:rPr>
-          <w:rFonts w:ascii="Calibri" w:cs="Calibri" w:eastAsia="Calibri" w:hAnsi="Calibri"/>
-        </w:rPr>
-        <w:t xml:space="preserve">After he is refused the night does not end. He forces his way in and the hunt begins:</w:t>
+        <w:t xml:space="preserve">Things to inspect: </w:t>
+      </w:r>
+      <w:r>
+        <w:rPr>
+          <w:rFonts w:ascii="Calibri" w:cs="Calibri" w:eastAsia="Calibri" w:hAnsi="Calibri"/>
+        </w:rPr>
+        <w:t xml:space="preserve">Besides the clues: the patrol clipboard, a dead light switch and two lockers in the hallway, and the mirror, sinks and stalls in the comfort room.</w:t>
       </w:r>
     </w:p>
     <w:p>
@@ -4956,15 +5011,23 @@
         <w:pStyle w:val="ListParagraph"/>
         <w:numPr>
           <w:ilvl w:val="0"/>
-          <w:numId w:val="6"/>
+          <w:numId w:val="2"/>
         </w:numPr>
         <w:spacing w:after="60"/>
       </w:pPr>
       <w:r>
         <w:rPr>
           <w:rFonts w:ascii="Calibri" w:cs="Calibri" w:eastAsia="Calibri" w:hAnsi="Calibri"/>
-        </w:rPr>
-        <w:t xml:space="preserve">Hiding: he hides in Classroom 1 or 2. A knock and a caption tell the player which door.</w:t>
+          <w:b/>
+          <w:bCs/>
+        </w:rPr>
+        <w:t xml:space="preserve">Tokens: </w:t>
+      </w:r>
+      <w:r>
+        <w:rPr>
+          <w:rFonts w:ascii="Calibri" w:cs="Calibri" w:eastAsia="Calibri" w:hAnsi="Calibri"/>
+        </w:rPr>
+        <w:t xml:space="preserve">Dropped by repelled anomalies and banked between runs. Three tokens open Endless and Challenge from the main menu.</w:t>
       </w:r>
     </w:p>
     <w:p>
@@ -4972,63 +5035,35 @@
         <w:pStyle w:val="ListParagraph"/>
         <w:numPr>
           <w:ilvl w:val="0"/>
-          <w:numId w:val="6"/>
+          <w:numId w:val="2"/>
         </w:numPr>
         <w:spacing w:after="60"/>
       </w:pPr>
       <w:r>
         <w:rPr>
           <w:rFonts w:ascii="Calibri" w:cs="Calibri" w:eastAsia="Calibri" w:hAnsi="Calibri"/>
-        </w:rPr>
-        <w:t xml:space="preserve">Tracking: the player peeks in with the lamp on. His picture shakes and circles in the dark; keeping the cursor on his head fills a hold meter. A full meter is a stun.</w:t>
-      </w:r>
-    </w:p>
-    <w:p>
-      <w:pPr>
-        <w:pStyle w:val="ListParagraph"/>
-        <w:numPr>
-          <w:ilvl w:val="0"/>
-          <w:numId w:val="6"/>
-        </w:numPr>
-        <w:spacing w:after="60"/>
-      </w:pPr>
-      <w:r>
-        <w:rPr>
-          <w:rFonts w:ascii="Calibri" w:cs="Calibri" w:eastAsia="Calibri" w:hAnsi="Calibri"/>
-        </w:rPr>
-        <w:t xml:space="preserve">Flicker: the lamp cuts out and he vanishes. He then hides in the other room or charges down the hallway, where the player must flash his face with the beam. A hit counts as a stun; a miss costs sanity.</w:t>
-      </w:r>
-    </w:p>
-    <w:p>
-      <w:pPr>
-        <w:pStyle w:val="ListParagraph"/>
-        <w:numPr>
-          <w:ilvl w:val="0"/>
-          <w:numId w:val="6"/>
-        </w:numPr>
-        <w:spacing w:after="60"/>
-      </w:pPr>
-      <w:r>
-        <w:rPr>
-          <w:rFonts w:ascii="Calibri" w:cs="Calibri" w:eastAsia="Calibri" w:hAnsi="Calibri"/>
-        </w:rPr>
-        <w:t xml:space="preserve">Win: four stuns drive him off and the normal Win or Secret ending follows.</w:t>
-      </w:r>
-    </w:p>
-    <w:p>
-      <w:pPr>
-        <w:pStyle w:val="ListParagraph"/>
-        <w:numPr>
-          <w:ilvl w:val="0"/>
-          <w:numId w:val="6"/>
-        </w:numPr>
-        <w:spacing w:after="60"/>
-      </w:pPr>
-      <w:r>
-        <w:rPr>
-          <w:rFonts w:ascii="Calibri" w:cs="Calibri" w:eastAsia="Calibri" w:hAnsi="Calibri"/>
-        </w:rPr>
-        <w:t xml:space="preserve">Lose: a SERVER DOOR meter (180 seconds, paused while he is held under the lamp) reaching zero means he reached the server room.</w:t>
+          <w:b/>
+          <w:bCs/>
+        </w:rPr>
+        <w:t xml:space="preserve">Clues: </w:t>
+      </w:r>
+      <w:r>
+        <w:rPr>
+          <w:rFonts w:ascii="Calibri" w:cs="Calibri" w:eastAsia="Calibri" w:hAnsi="Calibri"/>
+        </w:rPr>
+        <w:t xml:space="preserve">Ten clues in three areas (section 2.11). Inspecting one shows a close up picture beside its text.</w:t>
+      </w:r>
+    </w:p>
+    <w:p>
+      <w:pPr>
+        <w:pStyle w:val="Heading2"/>
+        <w:spacing w:after="120" w:before="240"/>
+      </w:pPr>
+      <w:r>
+        <w:rPr>
+          <w:rFonts w:ascii="Calibri" w:cs="Calibri" w:eastAsia="Calibri" w:hAnsi="Calibri"/>
+        </w:rPr>
+        <w:t xml:space="preserve">Night 5: the administrator and the hunt</w:t>
       </w:r>
     </w:p>
     <w:p>
@@ -5039,7 +5074,425 @@
         <w:rPr>
           <w:rFonts w:ascii="Calibri" w:cs="Calibri" w:eastAsia="Calibri" w:hAnsi="Calibri"/>
         </w:rPr>
-        <w:t xml:space="preserve">The hunt can never get stuck: every phase has a time limit, nothing else roams during it, the security door is locked, the battery is topped up, and leaving a peek is always possible. Quit and Continue resumes the hunt.</w:t>
+        <w:t xml:space="preserve">Night 5 has no students and no roaming anomalies, only the district administrator, who arrives with a staff badge and a roster memo that do not match. The four student questions do not apply to him. The player interrogates him instead (T): his badge name, his badge number, his face, his first stop, and any evidence found on patrol. Each answer has a follow-up that catches him out, and every lie exposed takes 15 seconds off the coming night, down to a minimum of 120 seconds. Talking never stamps. REFUSE ENTRY is the same as a DECLINE stamp. Allowing him in loses the game at once.</w:t>
+      </w:r>
+    </w:p>
+    <w:p>
+      <w:pPr>
+        <w:spacing w:after="120"/>
+      </w:pPr>
+      <w:r>
+        <w:rPr>
+          <w:rFonts w:ascii="Calibri" w:cs="Calibri" w:eastAsia="Calibri" w:hAnsi="Calibri"/>
+        </w:rPr>
+        <w:t xml:space="preserve">After he is refused the night does not end. It plays like the Nightmare Fredbear night of Five Nights at Freddy's 4: he forces his way in and is the only threat in the building, and the player survives until dawn (210 seconds). Footsteps mean he is walking. When they stop he is in one of three places:</w:t>
+      </w:r>
+    </w:p>
+    <w:tbl>
+      <w:tblPr>
+        <w:tblW w:type="dxa" w:w="9360"/>
+        <w:tblBorders>
+          <w:top w:val="single" w:color="auto" w:sz="4"/>
+          <w:left w:val="single" w:color="auto" w:sz="4"/>
+          <w:bottom w:val="single" w:color="auto" w:sz="4"/>
+          <w:right w:val="single" w:color="auto" w:sz="4"/>
+          <w:insideH w:val="single" w:color="auto" w:sz="4"/>
+          <w:insideV w:val="single" w:color="auto" w:sz="4"/>
+        </w:tblBorders>
+      </w:tblPr>
+      <w:tblGrid>
+        <w:gridCol w:w="2300"/>
+        <w:gridCol w:w="3000"/>
+        <w:gridCol w:w="4060"/>
+      </w:tblGrid>
+      <w:tr>
+        <w:trPr>
+          <w:tblHeader/>
+        </w:trPr>
+        <w:tc>
+          <w:tcPr>
+            <w:tcW w:type="dxa" w:w="2300"/>
+            <w:tcBorders>
+              <w:top w:val="single" w:color="808080" w:sz="4"/>
+              <w:left w:val="single" w:color="808080" w:sz="4"/>
+              <w:bottom w:val="single" w:color="808080" w:sz="4"/>
+              <w:right w:val="single" w:color="808080" w:sz="4"/>
+            </w:tcBorders>
+            <w:shd w:fill="E8E8E8" w:color="auto" w:val="clear"/>
+            <w:tcMar>
+              <w:top w:type="dxa" w:w="60"/>
+              <w:left w:type="dxa" w:w="100"/>
+              <w:bottom w:type="dxa" w:w="60"/>
+              <w:right w:type="dxa" w:w="100"/>
+            </w:tcMar>
+          </w:tcPr>
+          <w:p>
+            <w:r>
+              <w:rPr>
+                <w:rFonts w:ascii="Calibri" w:cs="Calibri" w:eastAsia="Calibri" w:hAnsi="Calibri"/>
+                <w:b/>
+                <w:bCs/>
+                <w:sz w:val="20"/>
+                <w:szCs w:val="20"/>
+              </w:rPr>
+              <w:t xml:space="preserve">Where he stops</w:t>
+            </w:r>
+          </w:p>
+        </w:tc>
+        <w:tc>
+          <w:tcPr>
+            <w:tcW w:type="dxa" w:w="3000"/>
+            <w:tcBorders>
+              <w:top w:val="single" w:color="808080" w:sz="4"/>
+              <w:left w:val="single" w:color="808080" w:sz="4"/>
+              <w:bottom w:val="single" w:color="808080" w:sz="4"/>
+              <w:right w:val="single" w:color="808080" w:sz="4"/>
+            </w:tcBorders>
+            <w:shd w:fill="E8E8E8" w:color="auto" w:val="clear"/>
+            <w:tcMar>
+              <w:top w:type="dxa" w:w="60"/>
+              <w:left w:type="dxa" w:w="100"/>
+              <w:bottom w:type="dxa" w:w="60"/>
+              <w:right w:type="dxa" w:w="100"/>
+            </w:tcMar>
+          </w:tcPr>
+          <w:p>
+            <w:r>
+              <w:rPr>
+                <w:rFonts w:ascii="Calibri" w:cs="Calibri" w:eastAsia="Calibri" w:hAnsi="Calibri"/>
+                <w:b/>
+                <w:bCs/>
+                <w:sz w:val="20"/>
+                <w:szCs w:val="20"/>
+              </w:rPr>
+              <w:t xml:space="preserve">FNaF 4 equivalent</w:t>
+            </w:r>
+          </w:p>
+        </w:tc>
+        <w:tc>
+          <w:tcPr>
+            <w:tcW w:type="dxa" w:w="4060"/>
+            <w:tcBorders>
+              <w:top w:val="single" w:color="808080" w:sz="4"/>
+              <w:left w:val="single" w:color="808080" w:sz="4"/>
+              <w:bottom w:val="single" w:color="808080" w:sz="4"/>
+              <w:right w:val="single" w:color="808080" w:sz="4"/>
+            </w:tcBorders>
+            <w:shd w:fill="E8E8E8" w:color="auto" w:val="clear"/>
+            <w:tcMar>
+              <w:top w:type="dxa" w:w="60"/>
+              <w:left w:type="dxa" w:w="100"/>
+              <w:bottom w:type="dxa" w:w="60"/>
+              <w:right w:type="dxa" w:w="100"/>
+            </w:tcMar>
+          </w:tcPr>
+          <w:p>
+            <w:r>
+              <w:rPr>
+                <w:rFonts w:ascii="Calibri" w:cs="Calibri" w:eastAsia="Calibri" w:hAnsi="Calibri"/>
+                <w:b/>
+                <w:bCs/>
+                <w:sz w:val="20"/>
+                <w:szCs w:val="20"/>
+              </w:rPr>
+              <w:t xml:space="preserve">Counter</w:t>
+            </w:r>
+          </w:p>
+        </w:tc>
+      </w:tr>
+      <w:tr>
+        <w:tc>
+          <w:tcPr>
+            <w:tcW w:type="dxa" w:w="2300"/>
+            <w:tcBorders>
+              <w:top w:val="single" w:color="808080" w:sz="4"/>
+              <w:left w:val="single" w:color="808080" w:sz="4"/>
+              <w:bottom w:val="single" w:color="808080" w:sz="4"/>
+              <w:right w:val="single" w:color="808080" w:sz="4"/>
+            </w:tcBorders>
+            <w:tcMar>
+              <w:top w:type="dxa" w:w="60"/>
+              <w:left w:type="dxa" w:w="100"/>
+              <w:bottom w:type="dxa" w:w="60"/>
+              <w:right w:type="dxa" w:w="100"/>
+            </w:tcMar>
+          </w:tcPr>
+          <w:p>
+            <w:r>
+              <w:rPr>
+                <w:rFonts w:ascii="Calibri" w:cs="Calibri" w:eastAsia="Calibri" w:hAnsi="Calibri"/>
+                <w:b w:val="false"/>
+                <w:bCs w:val="false"/>
+                <w:sz w:val="20"/>
+                <w:szCs w:val="20"/>
+              </w:rPr>
+              <w:t xml:space="preserve">At a classroom door</w:t>
+            </w:r>
+          </w:p>
+        </w:tc>
+        <w:tc>
+          <w:tcPr>
+            <w:tcW w:type="dxa" w:w="3000"/>
+            <w:tcBorders>
+              <w:top w:val="single" w:color="808080" w:sz="4"/>
+              <w:left w:val="single" w:color="808080" w:sz="4"/>
+              <w:bottom w:val="single" w:color="808080" w:sz="4"/>
+              <w:right w:val="single" w:color="808080" w:sz="4"/>
+            </w:tcBorders>
+            <w:tcMar>
+              <w:top w:type="dxa" w:w="60"/>
+              <w:left w:type="dxa" w:w="100"/>
+              <w:bottom w:type="dxa" w:w="60"/>
+              <w:right w:type="dxa" w:w="100"/>
+            </w:tcMar>
+          </w:tcPr>
+          <w:p>
+            <w:r>
+              <w:rPr>
+                <w:rFonts w:ascii="Calibri" w:cs="Calibri" w:eastAsia="Calibri" w:hAnsi="Calibri"/>
+                <w:b w:val="false"/>
+                <w:bCs w:val="false"/>
+                <w:sz w:val="20"/>
+                <w:szCs w:val="20"/>
+              </w:rPr>
+              <w:t xml:space="preserve">Left or right hall door</w:t>
+            </w:r>
+          </w:p>
+        </w:tc>
+        <w:tc>
+          <w:tcPr>
+            <w:tcW w:type="dxa" w:w="4060"/>
+            <w:tcBorders>
+              <w:top w:val="single" w:color="808080" w:sz="4"/>
+              <w:left w:val="single" w:color="808080" w:sz="4"/>
+              <w:bottom w:val="single" w:color="808080" w:sz="4"/>
+              <w:right w:val="single" w:color="808080" w:sz="4"/>
+            </w:tcBorders>
+            <w:tcMar>
+              <w:top w:type="dxa" w:w="60"/>
+              <w:left w:type="dxa" w:w="100"/>
+              <w:bottom w:type="dxa" w:w="60"/>
+              <w:right w:type="dxa" w:w="100"/>
+            </w:tcMar>
+          </w:tcPr>
+          <w:p>
+            <w:r>
+              <w:rPr>
+                <w:rFonts w:ascii="Calibri" w:cs="Calibri" w:eastAsia="Calibri" w:hAnsi="Calibri"/>
+                <w:b w:val="false"/>
+                <w:bCs w:val="false"/>
+                <w:sz w:val="20"/>
+                <w:szCs w:val="20"/>
+              </w:rPr>
+              <w:t xml:space="preserve">Stand at that door and hold E for 2 seconds, within 10 seconds</w:t>
+            </w:r>
+          </w:p>
+        </w:tc>
+      </w:tr>
+      <w:tr>
+        <w:tc>
+          <w:tcPr>
+            <w:tcW w:type="dxa" w:w="2300"/>
+            <w:tcBorders>
+              <w:top w:val="single" w:color="808080" w:sz="4"/>
+              <w:left w:val="single" w:color="808080" w:sz="4"/>
+              <w:bottom w:val="single" w:color="808080" w:sz="4"/>
+              <w:right w:val="single" w:color="808080" w:sz="4"/>
+            </w:tcBorders>
+            <w:tcMar>
+              <w:top w:type="dxa" w:w="60"/>
+              <w:left w:type="dxa" w:w="100"/>
+              <w:bottom w:type="dxa" w:w="60"/>
+              <w:right w:type="dxa" w:w="100"/>
+            </w:tcMar>
+          </w:tcPr>
+          <w:p>
+            <w:r>
+              <w:rPr>
+                <w:rFonts w:ascii="Calibri" w:cs="Calibri" w:eastAsia="Calibri" w:hAnsi="Calibri"/>
+                <w:b w:val="false"/>
+                <w:bCs w:val="false"/>
+                <w:sz w:val="20"/>
+                <w:szCs w:val="20"/>
+              </w:rPr>
+              <w:t xml:space="preserve">In the comfort room</w:t>
+            </w:r>
+          </w:p>
+        </w:tc>
+        <w:tc>
+          <w:tcPr>
+            <w:tcW w:type="dxa" w:w="3000"/>
+            <w:tcBorders>
+              <w:top w:val="single" w:color="808080" w:sz="4"/>
+              <w:left w:val="single" w:color="808080" w:sz="4"/>
+              <w:bottom w:val="single" w:color="808080" w:sz="4"/>
+              <w:right w:val="single" w:color="808080" w:sz="4"/>
+            </w:tcBorders>
+            <w:tcMar>
+              <w:top w:type="dxa" w:w="60"/>
+              <w:left w:type="dxa" w:w="100"/>
+              <w:bottom w:type="dxa" w:w="60"/>
+              <w:right w:type="dxa" w:w="100"/>
+            </w:tcMar>
+          </w:tcPr>
+          <w:p>
+            <w:r>
+              <w:rPr>
+                <w:rFonts w:ascii="Calibri" w:cs="Calibri" w:eastAsia="Calibri" w:hAnsi="Calibri"/>
+                <w:b w:val="false"/>
+                <w:bCs w:val="false"/>
+                <w:sz w:val="20"/>
+                <w:szCs w:val="20"/>
+              </w:rPr>
+              <w:t xml:space="preserve">The closet</w:t>
+            </w:r>
+          </w:p>
+        </w:tc>
+        <w:tc>
+          <w:tcPr>
+            <w:tcW w:type="dxa" w:w="4060"/>
+            <w:tcBorders>
+              <w:top w:val="single" w:color="808080" w:sz="4"/>
+              <w:left w:val="single" w:color="808080" w:sz="4"/>
+              <w:bottom w:val="single" w:color="808080" w:sz="4"/>
+              <w:right w:val="single" w:color="808080" w:sz="4"/>
+            </w:tcBorders>
+            <w:tcMar>
+              <w:top w:type="dxa" w:w="60"/>
+              <w:left w:type="dxa" w:w="100"/>
+              <w:bottom w:type="dxa" w:w="60"/>
+              <w:right w:type="dxa" w:w="100"/>
+            </w:tcMar>
+          </w:tcPr>
+          <w:p>
+            <w:r>
+              <w:rPr>
+                <w:rFonts w:ascii="Calibri" w:cs="Calibri" w:eastAsia="Calibri" w:hAnsi="Calibri"/>
+                <w:b w:val="false"/>
+                <w:bCs w:val="false"/>
+                <w:sz w:val="20"/>
+                <w:szCs w:val="20"/>
+              </w:rPr>
+              <w:t xml:space="preserve">Peek in and keep the lamp on his head for 1.8 seconds, within 12 seconds</w:t>
+            </w:r>
+          </w:p>
+        </w:tc>
+      </w:tr>
+      <w:tr>
+        <w:tc>
+          <w:tcPr>
+            <w:tcW w:type="dxa" w:w="2300"/>
+            <w:tcBorders>
+              <w:top w:val="single" w:color="808080" w:sz="4"/>
+              <w:left w:val="single" w:color="808080" w:sz="4"/>
+              <w:bottom w:val="single" w:color="808080" w:sz="4"/>
+              <w:right w:val="single" w:color="808080" w:sz="4"/>
+            </w:tcBorders>
+            <w:tcMar>
+              <w:top w:type="dxa" w:w="60"/>
+              <w:left w:type="dxa" w:w="100"/>
+              <w:bottom w:type="dxa" w:w="60"/>
+              <w:right w:type="dxa" w:w="100"/>
+            </w:tcMar>
+          </w:tcPr>
+          <w:p>
+            <w:r>
+              <w:rPr>
+                <w:rFonts w:ascii="Calibri" w:cs="Calibri" w:eastAsia="Calibri" w:hAnsi="Calibri"/>
+                <w:b w:val="false"/>
+                <w:bCs w:val="false"/>
+                <w:sz w:val="20"/>
+                <w:szCs w:val="20"/>
+              </w:rPr>
+              <w:t xml:space="preserve">Right behind you in the hallway</w:t>
+            </w:r>
+          </w:p>
+        </w:tc>
+        <w:tc>
+          <w:tcPr>
+            <w:tcW w:type="dxa" w:w="3000"/>
+            <w:tcBorders>
+              <w:top w:val="single" w:color="808080" w:sz="4"/>
+              <w:left w:val="single" w:color="808080" w:sz="4"/>
+              <w:bottom w:val="single" w:color="808080" w:sz="4"/>
+              <w:right w:val="single" w:color="808080" w:sz="4"/>
+            </w:tcBorders>
+            <w:tcMar>
+              <w:top w:type="dxa" w:w="60"/>
+              <w:left w:type="dxa" w:w="100"/>
+              <w:bottom w:type="dxa" w:w="60"/>
+              <w:right w:type="dxa" w:w="100"/>
+            </w:tcMar>
+          </w:tcPr>
+          <w:p>
+            <w:r>
+              <w:rPr>
+                <w:rFonts w:ascii="Calibri" w:cs="Calibri" w:eastAsia="Calibri" w:hAnsi="Calibri"/>
+                <w:b w:val="false"/>
+                <w:bCs w:val="false"/>
+                <w:sz w:val="20"/>
+                <w:szCs w:val="20"/>
+              </w:rPr>
+              <w:t xml:space="preserve">The bed</w:t>
+            </w:r>
+          </w:p>
+        </w:tc>
+        <w:tc>
+          <w:tcPr>
+            <w:tcW w:type="dxa" w:w="4060"/>
+            <w:tcBorders>
+              <w:top w:val="single" w:color="808080" w:sz="4"/>
+              <w:left w:val="single" w:color="808080" w:sz="4"/>
+              <w:bottom w:val="single" w:color="808080" w:sz="4"/>
+              <w:right w:val="single" w:color="808080" w:sz="4"/>
+            </w:tcBorders>
+            <w:tcMar>
+              <w:top w:type="dxa" w:w="60"/>
+              <w:left w:type="dxa" w:w="100"/>
+              <w:bottom w:type="dxa" w:w="60"/>
+              <w:right w:type="dxa" w:w="100"/>
+            </w:tcMar>
+          </w:tcPr>
+          <w:p>
+            <w:r>
+              <w:rPr>
+                <w:rFonts w:ascii="Calibri" w:cs="Calibri" w:eastAsia="Calibri" w:hAnsi="Calibri"/>
+                <w:b w:val="false"/>
+                <w:bCs w:val="false"/>
+                <w:sz w:val="20"/>
+                <w:szCs w:val="20"/>
+              </w:rPr>
+              <w:t xml:space="preserve">Flash his face with the beam within 2.6 seconds</w:t>
+            </w:r>
+          </w:p>
+        </w:tc>
+      </w:tr>
+    </w:tbl>
+    <w:p>
+      <w:pPr>
+        <w:spacing w:after="120"/>
+      </w:pPr>
+    </w:p>
+    <w:p>
+      <w:pPr>
+        <w:spacing w:after="120"/>
+      </w:pPr>
+      <w:r>
+        <w:rPr>
+          <w:rFonts w:ascii="Calibri" w:cs="Calibri" w:eastAsia="Calibri" w:hAnsi="Calibri"/>
+        </w:rPr>
+        <w:t xml:space="preserve">Too slow and he catches the player: sanity drops and they are thrown back. Three catches and he reaches the server door, which is the Lose ending. Dawn is the Win or Secret ending. He stops more often as dawn nears.</w:t>
+      </w:r>
+    </w:p>
+    <w:p>
+      <w:pPr>
+        <w:spacing w:after="120"/>
+      </w:pPr>
+      <w:r>
+        <w:rPr>
+          <w:rFonts w:ascii="Calibri" w:cs="Calibri" w:eastAsia="Calibri" w:hAnsi="Calibri"/>
+        </w:rPr>
+        <w:t xml:space="preserve">The hunt can never get stuck: the dawn clock always runs, every phase has a time limit, the security door is locked, and leaving a peek is always possible. Quit and Continue restarts the hunt.</w:t>
       </w:r>
     </w:p>
     <w:p>
@@ -5953,7 +6406,7 @@
         <w:pStyle w:val="ListParagraph"/>
         <w:numPr>
           <w:ilvl w:val="0"/>
-          <w:numId w:val="7"/>
+          <w:numId w:val="6"/>
         </w:numPr>
         <w:spacing w:after="60"/>
       </w:pPr>
@@ -5962,6 +6415,115 @@
           <w:rFonts w:ascii="Calibri" w:cs="Calibri" w:eastAsia="Calibri" w:hAnsi="Calibri"/>
         </w:rPr>
         <w:t xml:space="preserve">Every visitor must be inspected at the window before the player stamps.</w:t>
+      </w:r>
+    </w:p>
+    <w:p>
+      <w:pPr>
+        <w:pStyle w:val="ListParagraph"/>
+        <w:numPr>
+          <w:ilvl w:val="0"/>
+          <w:numId w:val="6"/>
+        </w:numPr>
+        <w:spacing w:after="60"/>
+      </w:pPr>
+      <w:r>
+        <w:rPr>
+          <w:rFonts w:ascii="Calibri" w:cs="Calibri" w:eastAsia="Calibri" w:hAnsi="Calibri"/>
+        </w:rPr>
+        <w:t xml:space="preserve">An expired ID must never be accepted.</w:t>
+      </w:r>
+    </w:p>
+    <w:p>
+      <w:pPr>
+        <w:pStyle w:val="ListParagraph"/>
+        <w:numPr>
+          <w:ilvl w:val="0"/>
+          <w:numId w:val="6"/>
+        </w:numPr>
+        <w:spacing w:after="60"/>
+      </w:pPr>
+      <w:r>
+        <w:rPr>
+          <w:rFonts w:ascii="Calibri" w:cs="Calibri" w:eastAsia="Calibri" w:hAnsi="Calibri"/>
+        </w:rPr>
+        <w:t xml:space="preserve">The stamp is permanent once the ID is handed back.</w:t>
+      </w:r>
+    </w:p>
+    <w:p>
+      <w:pPr>
+        <w:pStyle w:val="ListParagraph"/>
+        <w:numPr>
+          <w:ilvl w:val="0"/>
+          <w:numId w:val="6"/>
+        </w:numPr>
+        <w:spacing w:after="60"/>
+      </w:pPr>
+      <w:r>
+        <w:rPr>
+          <w:rFonts w:ascii="Calibri" w:cs="Calibri" w:eastAsia="Calibri" w:hAnsi="Calibri"/>
+        </w:rPr>
+        <w:t xml:space="preserve">A false rejection and a breach are both mistakes. Three of either ends the run.</w:t>
+      </w:r>
+    </w:p>
+    <w:p>
+      <w:pPr>
+        <w:pStyle w:val="ListParagraph"/>
+        <w:numPr>
+          <w:ilvl w:val="0"/>
+          <w:numId w:val="6"/>
+        </w:numPr>
+        <w:spacing w:after="60"/>
+      </w:pPr>
+      <w:r>
+        <w:rPr>
+          <w:rFonts w:ascii="Calibri" w:cs="Calibri" w:eastAsia="Calibri" w:hAnsi="Calibri"/>
+        </w:rPr>
+        <w:t xml:space="preserve">Each night has a fixed number of visitors: 4, 6, 7 and 8, then only the administrator on night 5.</w:t>
+      </w:r>
+    </w:p>
+    <w:p>
+      <w:pPr>
+        <w:pStyle w:val="ListParagraph"/>
+        <w:numPr>
+          <w:ilvl w:val="0"/>
+          <w:numId w:val="6"/>
+        </w:numPr>
+        <w:spacing w:after="60"/>
+      </w:pPr>
+      <w:r>
+        <w:rPr>
+          <w:rFonts w:ascii="Calibri" w:cs="Calibri" w:eastAsia="Calibri" w:hAnsi="Calibri"/>
+        </w:rPr>
+        <w:t xml:space="preserve">The player can ask only two questions per student. The administrator gets his own interrogation instead.</w:t>
+      </w:r>
+    </w:p>
+    <w:p>
+      <w:pPr>
+        <w:pStyle w:val="ListParagraph"/>
+        <w:numPr>
+          <w:ilvl w:val="0"/>
+          <w:numId w:val="6"/>
+        </w:numPr>
+        <w:spacing w:after="60"/>
+      </w:pPr>
+      <w:r>
+        <w:rPr>
+          <w:rFonts w:ascii="Calibri" w:cs="Calibri" w:eastAsia="Calibri" w:hAnsi="Calibri"/>
+        </w:rPr>
+        <w:t xml:space="preserve">The Win ending needs five nights, dawn on the last one, and fewer than three of each mistake.</w:t>
+      </w:r>
+    </w:p>
+    <w:p>
+      <w:pPr>
+        <w:spacing w:after="120"/>
+      </w:pPr>
+      <w:r>
+        <w:rPr>
+          <w:rFonts w:ascii="Calibri" w:cs="Calibri" w:eastAsia="Calibri" w:hAnsi="Calibri"/>
+          <w:b/>
+          <w:bCs/>
+        </w:rPr>
+        <w:t xml:space="preserve">Representative challenges</w:t>
       </w:r>
     </w:p>
     <w:p>
@@ -5977,7 +6539,7 @@
         <w:rPr>
           <w:rFonts w:ascii="Calibri" w:cs="Calibri" w:eastAsia="Calibri" w:hAnsi="Calibri"/>
         </w:rPr>
-        <w:t xml:space="preserve">An expired ID must never be accepted.</w:t>
+        <w:t xml:space="preserve">Night 1: learn the window, the stamps, the files and the questions on routine cases.</w:t>
       </w:r>
     </w:p>
     <w:p>
@@ -5993,7 +6555,7 @@
         <w:rPr>
           <w:rFonts w:ascii="Calibri" w:cs="Calibri" w:eastAsia="Calibri" w:hAnsi="Calibri"/>
         </w:rPr>
-        <w:t xml:space="preserve">The stamp is permanent once the ID is handed back.</w:t>
+        <w:t xml:space="preserve">A subtle mismatch: one feature of the face, or one letter of the name, is off.</w:t>
       </w:r>
     </w:p>
     <w:p>
@@ -6009,7 +6571,7 @@
         <w:rPr>
           <w:rFonts w:ascii="Calibri" w:cs="Calibri" w:eastAsia="Calibri" w:hAnsi="Calibri"/>
         </w:rPr>
-        <w:t xml:space="preserve">A false rejection and a breach are both mistakes. Three of either ends the run.</w:t>
+        <w:t xml:space="preserve">A clean looking student whose answer disagrees with the file.</w:t>
       </w:r>
     </w:p>
     <w:p>
@@ -6025,7 +6587,7 @@
         <w:rPr>
           <w:rFonts w:ascii="Calibri" w:cs="Calibri" w:eastAsia="Calibri" w:hAnsi="Calibri"/>
         </w:rPr>
-        <w:t xml:space="preserve">Each night has a fixed number of visitors: 4, 6, 7, 8 and 8, plus the administrator on night 5.</w:t>
+        <w:t xml:space="preserve">Choosing which two of four questions to spend, when two are locked until the ID is flipped or the file is opened.</w:t>
       </w:r>
     </w:p>
     <w:p>
@@ -6041,7 +6603,7 @@
         <w:rPr>
           <w:rFonts w:ascii="Calibri" w:cs="Calibri" w:eastAsia="Calibri" w:hAnsi="Calibri"/>
         </w:rPr>
-        <w:t xml:space="preserve">The player can ask only two questions per student.</w:t>
+        <w:t xml:space="preserve">The dark hallway: a roaming anomaly can frighten the player away from the desk.</w:t>
       </w:r>
     </w:p>
     <w:p>
@@ -6057,20 +6619,7 @@
         <w:rPr>
           <w:rFonts w:ascii="Calibri" w:cs="Calibri" w:eastAsia="Calibri" w:hAnsi="Calibri"/>
         </w:rPr>
-        <w:t xml:space="preserve">The Win ending needs five nights, the administrator driven off, and fewer than three of each mistake.</w:t>
-      </w:r>
-    </w:p>
-    <w:p>
-      <w:pPr>
-        <w:spacing w:after="120"/>
-      </w:pPr>
-      <w:r>
-        <w:rPr>
-          <w:rFonts w:ascii="Calibri" w:cs="Calibri" w:eastAsia="Calibri" w:hAnsi="Calibri"/>
-          <w:b/>
-          <w:bCs/>
-        </w:rPr>
-        <w:t xml:space="preserve">Representative challenges</w:t>
+        <w:t xml:space="preserve">The dark classroom: anomalies and clues are only seen under the lamp.</w:t>
       </w:r>
     </w:p>
     <w:p>
@@ -6078,7 +6627,7 @@
         <w:pStyle w:val="ListParagraph"/>
         <w:numPr>
           <w:ilvl w:val="0"/>
-          <w:numId w:val="8"/>
+          <w:numId w:val="7"/>
         </w:numPr>
         <w:spacing w:after="60"/>
       </w:pPr>
@@ -6086,103 +6635,7 @@
         <w:rPr>
           <w:rFonts w:ascii="Calibri" w:cs="Calibri" w:eastAsia="Calibri" w:hAnsi="Calibri"/>
         </w:rPr>
-        <w:t xml:space="preserve">Night 1: learn the window, the stamps, the files and the questions on routine cases.</w:t>
-      </w:r>
-    </w:p>
-    <w:p>
-      <w:pPr>
-        <w:pStyle w:val="ListParagraph"/>
-        <w:numPr>
-          <w:ilvl w:val="0"/>
-          <w:numId w:val="8"/>
-        </w:numPr>
-        <w:spacing w:after="60"/>
-      </w:pPr>
-      <w:r>
-        <w:rPr>
-          <w:rFonts w:ascii="Calibri" w:cs="Calibri" w:eastAsia="Calibri" w:hAnsi="Calibri"/>
-        </w:rPr>
-        <w:t xml:space="preserve">A subtle mismatch: one feature of the face, or one letter of the name, is off.</w:t>
-      </w:r>
-    </w:p>
-    <w:p>
-      <w:pPr>
-        <w:pStyle w:val="ListParagraph"/>
-        <w:numPr>
-          <w:ilvl w:val="0"/>
-          <w:numId w:val="8"/>
-        </w:numPr>
-        <w:spacing w:after="60"/>
-      </w:pPr>
-      <w:r>
-        <w:rPr>
-          <w:rFonts w:ascii="Calibri" w:cs="Calibri" w:eastAsia="Calibri" w:hAnsi="Calibri"/>
-        </w:rPr>
-        <w:t xml:space="preserve">A clean looking student whose answer disagrees with the file.</w:t>
-      </w:r>
-    </w:p>
-    <w:p>
-      <w:pPr>
-        <w:pStyle w:val="ListParagraph"/>
-        <w:numPr>
-          <w:ilvl w:val="0"/>
-          <w:numId w:val="8"/>
-        </w:numPr>
-        <w:spacing w:after="60"/>
-      </w:pPr>
-      <w:r>
-        <w:rPr>
-          <w:rFonts w:ascii="Calibri" w:cs="Calibri" w:eastAsia="Calibri" w:hAnsi="Calibri"/>
-        </w:rPr>
-        <w:t xml:space="preserve">Choosing which two of four questions to spend, when two are locked until the ID is flipped or the file is opened.</w:t>
-      </w:r>
-    </w:p>
-    <w:p>
-      <w:pPr>
-        <w:pStyle w:val="ListParagraph"/>
-        <w:numPr>
-          <w:ilvl w:val="0"/>
-          <w:numId w:val="8"/>
-        </w:numPr>
-        <w:spacing w:after="60"/>
-      </w:pPr>
-      <w:r>
-        <w:rPr>
-          <w:rFonts w:ascii="Calibri" w:cs="Calibri" w:eastAsia="Calibri" w:hAnsi="Calibri"/>
-        </w:rPr>
-        <w:t xml:space="preserve">The dark hallway: a roaming anomaly can frighten the player away from the desk.</w:t>
-      </w:r>
-    </w:p>
-    <w:p>
-      <w:pPr>
-        <w:pStyle w:val="ListParagraph"/>
-        <w:numPr>
-          <w:ilvl w:val="0"/>
-          <w:numId w:val="8"/>
-        </w:numPr>
-        <w:spacing w:after="60"/>
-      </w:pPr>
-      <w:r>
-        <w:rPr>
-          <w:rFonts w:ascii="Calibri" w:cs="Calibri" w:eastAsia="Calibri" w:hAnsi="Calibri"/>
-        </w:rPr>
-        <w:t xml:space="preserve">The dark classroom: anomalies and clues are only seen under the lamp.</w:t>
-      </w:r>
-    </w:p>
-    <w:p>
-      <w:pPr>
-        <w:pStyle w:val="ListParagraph"/>
-        <w:numPr>
-          <w:ilvl w:val="0"/>
-          <w:numId w:val="8"/>
-        </w:numPr>
-        <w:spacing w:after="60"/>
-      </w:pPr>
-      <w:r>
-        <w:rPr>
-          <w:rFonts w:ascii="Calibri" w:cs="Calibri" w:eastAsia="Calibri" w:hAnsi="Calibri"/>
-        </w:rPr>
-        <w:t xml:space="preserve">Night 5: trust an official or trust the evidence.</w:t>
+        <w:t xml:space="preserve">Night 5: trust an official or trust the evidence, then read his footsteps until dawn.</w:t>
       </w:r>
     </w:p>
     <w:p>
@@ -6384,7 +6837,7 @@
         <w:rPr>
           <w:rFonts w:ascii="Calibri" w:cs="Calibri" w:eastAsia="Calibri" w:hAnsi="Calibri"/>
         </w:rPr>
-        <w:t xml:space="preserve">The limit of three for each mistake, the arrival clock, the hunt timers (4 stuns, 180 seconds) and the sanity values are design values that still need playtesting. Tunable numbers live in one settings asset (GameConfig).</w:t>
+        <w:t xml:space="preserve">The limit of three for each mistake, the arrival clock, the hunt timers (3 catches, 210 seconds to dawn) and the sanity values are design values that still need playtesting. Tunable numbers live in one settings asset (GameConfig).</w:t>
       </w:r>
     </w:p>
     <w:p>
@@ -7306,7 +7759,7 @@
                 <w:sz w:val="20"/>
                 <w:szCs w:val="20"/>
               </w:rPr>
-              <w:t xml:space="preserve">8 + admin</w:t>
+              <w:t xml:space="preserve">Admin only</w:t>
             </w:r>
           </w:p>
         </w:tc>
@@ -7335,7 +7788,7 @@
                 <w:sz w:val="20"/>
                 <w:szCs w:val="20"/>
               </w:rPr>
-              <w:t xml:space="preserve">4</w:t>
+              <w:t xml:space="preserve">0</w:t>
             </w:r>
           </w:p>
         </w:tc>
@@ -7364,7 +7817,7 @@
                 <w:sz w:val="20"/>
                 <w:szCs w:val="20"/>
               </w:rPr>
-              <w:t xml:space="preserve">The administrator arrives, is refused, and is hunted.</w:t>
+              <w:t xml:space="preserve">Interrogate him, refuse him, survive him until dawn.</w:t>
             </w:r>
           </w:p>
         </w:tc>
@@ -8330,7 +8783,7 @@
         <w:rPr>
           <w:rFonts w:ascii="Calibri" w:cs="Calibri" w:eastAsia="Calibri" w:hAnsi="Calibri"/>
         </w:rPr>
-        <w:t xml:space="preserve">A fixed security room for inspection, a side scrolling hallway for patrol, two peek only classrooms, and one walkable comfort room.</w:t>
+        <w:t xml:space="preserve">A fixed security room for inspection, a side scrolling hallway for patrol, and three peek only rooms: two classrooms and a comfort room.</w:t>
       </w:r>
     </w:p>
     <w:tbl>
@@ -8618,7 +9071,7 @@
                 <w:sz w:val="20"/>
                 <w:szCs w:val="20"/>
               </w:rPr>
-              <w:t xml:space="preserve">Two classroom doors, the security door at the west end, the comfort room door and the sealed server door at the east end, lockers, notice board, flyer, clock, ceiling lights with switches. The corridor art swaps between lit and unlit.</w:t>
+              <w:t xml:space="preserve">Two classroom doors, the security door at the west end, the comfort room door and the sealed server door at the east end, lockers, notice board, flyer, clock, clipboard, a dead switch.</w:t>
             </w:r>
           </w:p>
         </w:tc>
@@ -8767,7 +9220,7 @@
                 <w:sz w:val="20"/>
                 <w:szCs w:val="20"/>
               </w:rPr>
-              <w:t xml:space="preserve">Walk in with E, very dark</w:t>
+              <w:t xml:space="preserve">Peek with a lamp from the doorway</w:t>
             </w:r>
           </w:p>
         </w:tc>
@@ -8796,7 +9249,7 @@
                 <w:sz w:val="20"/>
                 <w:szCs w:val="20"/>
               </w:rPr>
-              <w:t xml:space="preserve">A dim bathroom lit only by the flashlight</w:t>
+              <w:t xml:space="preserve">A dim bathroom: mirror, sinks and stalls to inspect; his hiding place on night 5</w:t>
             </w:r>
           </w:p>
         </w:tc>
@@ -9928,7 +10381,7 @@
         <w:rPr>
           <w:rFonts w:ascii="Calibri" w:cs="Calibri" w:eastAsia="Calibri" w:hAnsi="Calibri"/>
         </w:rPr>
-        <w:t xml:space="preserve">A painted desk, a 30 unit wide painted hallway in lit and unlit versions, painted classroom and comfort room backdrops, and close up pictures of the clues.</w:t>
+        <w:t xml:space="preserve">A painted desk, a 30 unit wide painted hallway, painted classroom and comfort room backdrops, and close up pictures of the clues.</w:t>
       </w:r>
     </w:p>
     <w:p>
@@ -11166,7 +11619,7 @@
                 <w:sz w:val="20"/>
                 <w:szCs w:val="20"/>
               </w:rPr>
-              <w:t xml:space="preserve">Interact (doors, clues, switches, peek entry and exit, comfort room)</w:t>
+              <w:t xml:space="preserve">Interact (doors, clues, inspectable things, peek entry and exit)</w:t>
             </w:r>
           </w:p>
         </w:tc>
@@ -11196,6 +11649,66 @@
                 <w:szCs w:val="20"/>
               </w:rPr>
               <w:t xml:space="preserve">E</w:t>
+            </w:r>
+          </w:p>
+        </w:tc>
+      </w:tr>
+      <w:tr>
+        <w:tc>
+          <w:tcPr>
+            <w:tcW w:type="dxa" w:w="4300"/>
+            <w:tcBorders>
+              <w:top w:val="single" w:color="808080" w:sz="4"/>
+              <w:left w:val="single" w:color="808080" w:sz="4"/>
+              <w:bottom w:val="single" w:color="808080" w:sz="4"/>
+              <w:right w:val="single" w:color="808080" w:sz="4"/>
+            </w:tcBorders>
+            <w:tcMar>
+              <w:top w:type="dxa" w:w="60"/>
+              <w:left w:type="dxa" w:w="100"/>
+              <w:bottom w:type="dxa" w:w="60"/>
+              <w:right w:type="dxa" w:w="100"/>
+            </w:tcMar>
+          </w:tcPr>
+          <w:p>
+            <w:r>
+              <w:rPr>
+                <w:rFonts w:ascii="Calibri" w:cs="Calibri" w:eastAsia="Calibri" w:hAnsi="Calibri"/>
+                <w:b w:val="false"/>
+                <w:bCs w:val="false"/>
+                <w:sz w:val="20"/>
+                <w:szCs w:val="20"/>
+              </w:rPr>
+              <w:t xml:space="preserve">Night 5: hold a door shut</w:t>
+            </w:r>
+          </w:p>
+        </w:tc>
+        <w:tc>
+          <w:tcPr>
+            <w:tcW w:type="dxa" w:w="5060"/>
+            <w:tcBorders>
+              <w:top w:val="single" w:color="808080" w:sz="4"/>
+              <w:left w:val="single" w:color="808080" w:sz="4"/>
+              <w:bottom w:val="single" w:color="808080" w:sz="4"/>
+              <w:right w:val="single" w:color="808080" w:sz="4"/>
+            </w:tcBorders>
+            <w:tcMar>
+              <w:top w:type="dxa" w:w="60"/>
+              <w:left w:type="dxa" w:w="100"/>
+              <w:bottom w:type="dxa" w:w="60"/>
+              <w:right w:type="dxa" w:w="100"/>
+            </w:tcMar>
+          </w:tcPr>
+          <w:p>
+            <w:r>
+              <w:rPr>
+                <w:rFonts w:ascii="Calibri" w:cs="Calibri" w:eastAsia="Calibri" w:hAnsi="Calibri"/>
+                <w:b w:val="false"/>
+                <w:bCs w:val="false"/>
+                <w:sz w:val="20"/>
+                <w:szCs w:val="20"/>
+              </w:rPr>
+              <w:t xml:space="preserve">Hold E at the door</w:t>
             </w:r>
           </w:p>
         </w:tc>
@@ -11532,7 +12045,7 @@
         <w:rPr>
           <w:rFonts w:ascii="Calibri" w:cs="Calibri" w:eastAsia="Calibri" w:hAnsi="Calibri"/>
         </w:rPr>
-        <w:t xml:space="preserve">Night number, date, waiting count and visitors still to come tonight, in game clock (22:00 to 02:00), sanity bar, and the prompt line that names the next step.</w:t>
+        <w:t xml:space="preserve">Night number, date, waiting count and visitors still to come tonight, in game clock (22:00 to 02:00), sanity bar, and the prompt line under the desk buttons that names the next step.</w:t>
       </w:r>
     </w:p>
     <w:p>
@@ -11548,7 +12061,7 @@
         <w:rPr>
           <w:rFonts w:ascii="Calibri" w:cs="Calibri" w:eastAsia="Calibri" w:hAnsi="Calibri"/>
         </w:rPr>
-        <w:t xml:space="preserve">In patrol: flashlight mode, battery and clue notifications. While peeking a bar at the bottom shows the controls. During the hunt: SERVER DOOR percentage and stun count.</w:t>
+        <w:t xml:space="preserve">In patrol: flashlight mode, battery and clue notifications. While peeking a bar at the bottom shows the controls. During the hunt: progress to dawn and catches so far.</w:t>
       </w:r>
     </w:p>
     <w:p>
@@ -14289,7 +14802,7 @@
                 <w:sz w:val="20"/>
                 <w:szCs w:val="20"/>
               </w:rPr>
-              <w:t xml:space="preserve">Painted corridor uses the whole 30 unit painting</w:t>
+              <w:t xml:space="preserve">Painted corridor uses the whole 30 unit painting; walkers stand on the painted floor</w:t>
             </w:r>
           </w:p>
         </w:tc>
@@ -14467,7 +14980,7 @@
                 <w:sz w:val="20"/>
                 <w:szCs w:val="20"/>
               </w:rPr>
-              <w:t xml:space="preserve">Walkable and very dark; needs playtest</w:t>
+              <w:t xml:space="preserve">Peek only, with three things to inspect</w:t>
             </w:r>
           </w:p>
         </w:tc>
@@ -14498,7 +15011,7 @@
                 <w:sz w:val="20"/>
                 <w:szCs w:val="20"/>
               </w:rPr>
-              <w:t xml:space="preserve">Administrator hunt</w:t>
+              <w:t xml:space="preserve">Tokens on the main menu</w:t>
             </w:r>
           </w:p>
         </w:tc>
@@ -14556,7 +15069,274 @@
                 <w:sz w:val="20"/>
                 <w:szCs w:val="20"/>
               </w:rPr>
-              <w:t xml:space="preserve">Four stuns, server door timer, never stuck</w:t>
+              <w:t xml:space="preserve">Three tokens open Endless and Challenge</w:t>
+            </w:r>
+          </w:p>
+        </w:tc>
+      </w:tr>
+      <w:tr>
+        <w:tc>
+          <w:tcPr>
+            <w:tcW w:type="dxa" w:w="3200"/>
+            <w:tcBorders>
+              <w:top w:val="single" w:color="808080" w:sz="4"/>
+              <w:left w:val="single" w:color="808080" w:sz="4"/>
+              <w:bottom w:val="single" w:color="808080" w:sz="4"/>
+              <w:right w:val="single" w:color="808080" w:sz="4"/>
+            </w:tcBorders>
+            <w:tcMar>
+              <w:top w:type="dxa" w:w="60"/>
+              <w:left w:type="dxa" w:w="100"/>
+              <w:bottom w:type="dxa" w:w="60"/>
+              <w:right w:type="dxa" w:w="100"/>
+            </w:tcMar>
+          </w:tcPr>
+          <w:p>
+            <w:r>
+              <w:rPr>
+                <w:rFonts w:ascii="Calibri" w:cs="Calibri" w:eastAsia="Calibri" w:hAnsi="Calibri"/>
+                <w:b w:val="false"/>
+                <w:bCs w:val="false"/>
+                <w:sz w:val="20"/>
+                <w:szCs w:val="20"/>
+              </w:rPr>
+              <w:t xml:space="preserve">Night opening sequence and how to play card</w:t>
+            </w:r>
+          </w:p>
+        </w:tc>
+        <w:tc>
+          <w:tcPr>
+            <w:tcW w:type="dxa" w:w="1700"/>
+            <w:tcBorders>
+              <w:top w:val="single" w:color="808080" w:sz="4"/>
+              <w:left w:val="single" w:color="808080" w:sz="4"/>
+              <w:bottom w:val="single" w:color="808080" w:sz="4"/>
+              <w:right w:val="single" w:color="808080" w:sz="4"/>
+            </w:tcBorders>
+            <w:tcMar>
+              <w:top w:type="dxa" w:w="60"/>
+              <w:left w:type="dxa" w:w="100"/>
+              <w:bottom w:type="dxa" w:w="60"/>
+              <w:right w:type="dxa" w:w="100"/>
+            </w:tcMar>
+          </w:tcPr>
+          <w:p>
+            <w:r>
+              <w:rPr>
+                <w:rFonts w:ascii="Calibri" w:cs="Calibri" w:eastAsia="Calibri" w:hAnsi="Calibri"/>
+                <w:b w:val="false"/>
+                <w:bCs w:val="false"/>
+                <w:sz w:val="20"/>
+                <w:szCs w:val="20"/>
+              </w:rPr>
+              <w:t xml:space="preserve">Built</w:t>
+            </w:r>
+          </w:p>
+        </w:tc>
+        <w:tc>
+          <w:tcPr>
+            <w:tcW w:type="dxa" w:w="4460"/>
+            <w:tcBorders>
+              <w:top w:val="single" w:color="808080" w:sz="4"/>
+              <w:left w:val="single" w:color="808080" w:sz="4"/>
+              <w:bottom w:val="single" w:color="808080" w:sz="4"/>
+              <w:right w:val="single" w:color="808080" w:sz="4"/>
+            </w:tcBorders>
+            <w:tcMar>
+              <w:top w:type="dxa" w:w="60"/>
+              <w:left w:type="dxa" w:w="100"/>
+              <w:bottom w:type="dxa" w:w="60"/>
+              <w:right w:type="dxa" w:w="100"/>
+            </w:tcMar>
+          </w:tcPr>
+          <w:p>
+            <w:r>
+              <w:rPr>
+                <w:rFonts w:ascii="Calibri" w:cs="Calibri" w:eastAsia="Calibri" w:hAnsi="Calibri"/>
+                <w:b w:val="false"/>
+                <w:bCs w:val="false"/>
+                <w:sz w:val="20"/>
+                <w:szCs w:val="20"/>
+              </w:rPr>
+              <w:t xml:space="preserve">Black, title, dialogue, closed booth, open booth</w:t>
+            </w:r>
+          </w:p>
+        </w:tc>
+      </w:tr>
+      <w:tr>
+        <w:tc>
+          <w:tcPr>
+            <w:tcW w:type="dxa" w:w="3200"/>
+            <w:tcBorders>
+              <w:top w:val="single" w:color="808080" w:sz="4"/>
+              <w:left w:val="single" w:color="808080" w:sz="4"/>
+              <w:bottom w:val="single" w:color="808080" w:sz="4"/>
+              <w:right w:val="single" w:color="808080" w:sz="4"/>
+            </w:tcBorders>
+            <w:tcMar>
+              <w:top w:type="dxa" w:w="60"/>
+              <w:left w:type="dxa" w:w="100"/>
+              <w:bottom w:type="dxa" w:w="60"/>
+              <w:right w:type="dxa" w:w="100"/>
+            </w:tcMar>
+          </w:tcPr>
+          <w:p>
+            <w:r>
+              <w:rPr>
+                <w:rFonts w:ascii="Calibri" w:cs="Calibri" w:eastAsia="Calibri" w:hAnsi="Calibri"/>
+                <w:b w:val="false"/>
+                <w:bCs w:val="false"/>
+                <w:sz w:val="20"/>
+                <w:szCs w:val="20"/>
+              </w:rPr>
+              <w:t xml:space="preserve">Administrator interrogation</w:t>
+            </w:r>
+          </w:p>
+        </w:tc>
+        <w:tc>
+          <w:tcPr>
+            <w:tcW w:type="dxa" w:w="1700"/>
+            <w:tcBorders>
+              <w:top w:val="single" w:color="808080" w:sz="4"/>
+              <w:left w:val="single" w:color="808080" w:sz="4"/>
+              <w:bottom w:val="single" w:color="808080" w:sz="4"/>
+              <w:right w:val="single" w:color="808080" w:sz="4"/>
+            </w:tcBorders>
+            <w:tcMar>
+              <w:top w:type="dxa" w:w="60"/>
+              <w:left w:type="dxa" w:w="100"/>
+              <w:bottom w:type="dxa" w:w="60"/>
+              <w:right w:type="dxa" w:w="100"/>
+            </w:tcMar>
+          </w:tcPr>
+          <w:p>
+            <w:r>
+              <w:rPr>
+                <w:rFonts w:ascii="Calibri" w:cs="Calibri" w:eastAsia="Calibri" w:hAnsi="Calibri"/>
+                <w:b w:val="false"/>
+                <w:bCs w:val="false"/>
+                <w:sz w:val="20"/>
+                <w:szCs w:val="20"/>
+              </w:rPr>
+              <w:t xml:space="preserve">Built</w:t>
+            </w:r>
+          </w:p>
+        </w:tc>
+        <w:tc>
+          <w:tcPr>
+            <w:tcW w:type="dxa" w:w="4460"/>
+            <w:tcBorders>
+              <w:top w:val="single" w:color="808080" w:sz="4"/>
+              <w:left w:val="single" w:color="808080" w:sz="4"/>
+              <w:bottom w:val="single" w:color="808080" w:sz="4"/>
+              <w:right w:val="single" w:color="808080" w:sz="4"/>
+            </w:tcBorders>
+            <w:tcMar>
+              <w:top w:type="dxa" w:w="60"/>
+              <w:left w:type="dxa" w:w="100"/>
+              <w:bottom w:type="dxa" w:w="60"/>
+              <w:right w:type="dxa" w:w="100"/>
+            </w:tcMar>
+          </w:tcPr>
+          <w:p>
+            <w:r>
+              <w:rPr>
+                <w:rFonts w:ascii="Calibri" w:cs="Calibri" w:eastAsia="Calibri" w:hAnsi="Calibri"/>
+                <w:b w:val="false"/>
+                <w:bCs w:val="false"/>
+                <w:sz w:val="20"/>
+                <w:szCs w:val="20"/>
+              </w:rPr>
+              <w:t xml:space="preserve">No student questions; lies exposed shorten the night</w:t>
+            </w:r>
+          </w:p>
+        </w:tc>
+      </w:tr>
+      <w:tr>
+        <w:tc>
+          <w:tcPr>
+            <w:tcW w:type="dxa" w:w="3200"/>
+            <w:tcBorders>
+              <w:top w:val="single" w:color="808080" w:sz="4"/>
+              <w:left w:val="single" w:color="808080" w:sz="4"/>
+              <w:bottom w:val="single" w:color="808080" w:sz="4"/>
+              <w:right w:val="single" w:color="808080" w:sz="4"/>
+            </w:tcBorders>
+            <w:tcMar>
+              <w:top w:type="dxa" w:w="60"/>
+              <w:left w:type="dxa" w:w="100"/>
+              <w:bottom w:type="dxa" w:w="60"/>
+              <w:right w:type="dxa" w:w="100"/>
+            </w:tcMar>
+          </w:tcPr>
+          <w:p>
+            <w:r>
+              <w:rPr>
+                <w:rFonts w:ascii="Calibri" w:cs="Calibri" w:eastAsia="Calibri" w:hAnsi="Calibri"/>
+                <w:b w:val="false"/>
+                <w:bCs w:val="false"/>
+                <w:sz w:val="20"/>
+                <w:szCs w:val="20"/>
+              </w:rPr>
+              <w:t xml:space="preserve">Night 5 hunt</w:t>
+            </w:r>
+          </w:p>
+        </w:tc>
+        <w:tc>
+          <w:tcPr>
+            <w:tcW w:type="dxa" w:w="1700"/>
+            <w:tcBorders>
+              <w:top w:val="single" w:color="808080" w:sz="4"/>
+              <w:left w:val="single" w:color="808080" w:sz="4"/>
+              <w:bottom w:val="single" w:color="808080" w:sz="4"/>
+              <w:right w:val="single" w:color="808080" w:sz="4"/>
+            </w:tcBorders>
+            <w:tcMar>
+              <w:top w:type="dxa" w:w="60"/>
+              <w:left w:type="dxa" w:w="100"/>
+              <w:bottom w:type="dxa" w:w="60"/>
+              <w:right w:type="dxa" w:w="100"/>
+            </w:tcMar>
+          </w:tcPr>
+          <w:p>
+            <w:r>
+              <w:rPr>
+                <w:rFonts w:ascii="Calibri" w:cs="Calibri" w:eastAsia="Calibri" w:hAnsi="Calibri"/>
+                <w:b w:val="false"/>
+                <w:bCs w:val="false"/>
+                <w:sz w:val="20"/>
+                <w:szCs w:val="20"/>
+              </w:rPr>
+              <w:t xml:space="preserve">Built</w:t>
+            </w:r>
+          </w:p>
+        </w:tc>
+        <w:tc>
+          <w:tcPr>
+            <w:tcW w:type="dxa" w:w="4460"/>
+            <w:tcBorders>
+              <w:top w:val="single" w:color="808080" w:sz="4"/>
+              <w:left w:val="single" w:color="808080" w:sz="4"/>
+              <w:bottom w:val="single" w:color="808080" w:sz="4"/>
+              <w:right w:val="single" w:color="808080" w:sz="4"/>
+            </w:tcBorders>
+            <w:tcMar>
+              <w:top w:type="dxa" w:w="60"/>
+              <w:left w:type="dxa" w:w="100"/>
+              <w:bottom w:type="dxa" w:w="60"/>
+              <w:right w:type="dxa" w:w="100"/>
+            </w:tcMar>
+          </w:tcPr>
+          <w:p>
+            <w:r>
+              <w:rPr>
+                <w:rFonts w:ascii="Calibri" w:cs="Calibri" w:eastAsia="Calibri" w:hAnsi="Calibri"/>
+                <w:b w:val="false"/>
+                <w:bCs w:val="false"/>
+                <w:sz w:val="20"/>
+                <w:szCs w:val="20"/>
+              </w:rPr>
+              <w:t xml:space="preserve">Survive until dawn, three catches lose, never stuck. Needs balance playtest</w:t>
             </w:r>
           </w:p>
         </w:tc>
@@ -15804,13 +16584,13 @@
           <w:b/>
           <w:bCs/>
         </w:rPr>
-        <w:t xml:space="preserve">Stun: </w:t>
-      </w:r>
-      <w:r>
-        <w:rPr>
-          <w:rFonts w:ascii="Calibri" w:cs="Calibri" w:eastAsia="Calibri" w:hAnsi="Calibri"/>
-        </w:rPr>
-        <w:t xml:space="preserve">Driving the administrator back during the hunt.</w:t>
+        <w:t xml:space="preserve">Catch: </w:t>
+      </w:r>
+      <w:r>
+        <w:rPr>
+          <w:rFonts w:ascii="Calibri" w:cs="Calibri" w:eastAsia="Calibri" w:hAnsi="Calibri"/>
+        </w:rPr>
+        <w:t xml:space="preserve">The administrator reaching the player during the hunt. Three end the run.</w:t>
       </w:r>
     </w:p>
     <w:p>
@@ -15852,13 +16632,13 @@
           <w:b/>
           <w:bCs/>
         </w:rPr>
-        <w:t xml:space="preserve">Hold meter: </w:t>
-      </w:r>
-      <w:r>
-        <w:rPr>
-          <w:rFonts w:ascii="Calibri" w:cs="Calibri" w:eastAsia="Calibri" w:hAnsi="Calibri"/>
-        </w:rPr>
-        <w:t xml:space="preserve">The bar that fills while the cursor stays on the administrator's head.</w:t>
+        <w:t xml:space="preserve">Lie exposed: </w:t>
+      </w:r>
+      <w:r>
+        <w:rPr>
+          <w:rFonts w:ascii="Calibri" w:cs="Calibri" w:eastAsia="Calibri" w:hAnsi="Calibri"/>
+        </w:rPr>
+        <w:t xml:space="preserve">A follow-up that catches the administrator out. Each one shortens night 5.</w:t>
       </w:r>
     </w:p>
     <w:p>
@@ -16047,6 +16827,38 @@
           <w:rFonts w:ascii="Calibri" w:cs="Calibri" w:eastAsia="Calibri" w:hAnsi="Calibri"/>
         </w:rPr>
         <w:t xml:space="preserve">Unity, "Game Design Document (GDD) Template" (structure only).</w:t>
+      </w:r>
+    </w:p>
+    <w:p>
+      <w:pPr>
+        <w:pStyle w:val="ListParagraph"/>
+        <w:numPr>
+          <w:ilvl w:val="0"/>
+          <w:numId w:val="2"/>
+        </w:numPr>
+        <w:spacing w:after="60"/>
+      </w:pPr>
+      <w:r>
+        <w:rPr>
+          <w:rFonts w:ascii="Calibri" w:cs="Calibri" w:eastAsia="Calibri" w:hAnsi="Calibri"/>
+        </w:rPr>
+        <w:t xml:space="preserve">Nightmare Fredbear, FNaF Wiki (reference for the night 5 design): https://fivenightsatfreddys.fandom.com/wiki/Nightmare_Fredbear</w:t>
+      </w:r>
+    </w:p>
+    <w:p>
+      <w:pPr>
+        <w:pStyle w:val="ListParagraph"/>
+        <w:numPr>
+          <w:ilvl w:val="0"/>
+          <w:numId w:val="2"/>
+        </w:numPr>
+        <w:spacing w:after="60"/>
+      </w:pPr>
+      <w:r>
+        <w:rPr>
+          <w:rFonts w:ascii="Calibri" w:cs="Calibri" w:eastAsia="Calibri" w:hAnsi="Calibri"/>
+        </w:rPr>
+        <w:t xml:space="preserve">FNAF 4 Complete Guide, Steam Community (reference for the night 5 design): https://steamcommunity.com/sharedfiles/filedetails/?id=2806989911</w:t>
       </w:r>
     </w:p>
     <w:p>
@@ -16125,7 +16937,7 @@
         <w:sz w:val="18"/>
         <w:szCs w:val="18"/>
       </w:rPr>
-      <w:t xml:space="preserve">Show Me Your ID! Game Design Document v2.0   Page </w:t>
+      <w:t xml:space="preserve">Show Me Your ID! Game Design Document v2.1   Page </w:t>
     </w:r>
     <w:r>
       <w:rPr>
@@ -16413,18 +17225,12 @@
     </w:lvlOverride>
   </w:num>
   <w:num w:numId="6">
-    <w:abstractNumId w:val="7"/>
+    <w:abstractNumId w:val="8"/>
     <w:lvlOverride w:ilvl="0">
       <w:startOverride w:val="1"/>
     </w:lvlOverride>
   </w:num>
   <w:num w:numId="7">
-    <w:abstractNumId w:val="8"/>
-    <w:lvlOverride w:ilvl="0">
-      <w:startOverride w:val="1"/>
-    </w:lvlOverride>
-  </w:num>
-  <w:num w:numId="8">
     <w:abstractNumId w:val="9"/>
     <w:lvlOverride w:ilvl="0">
       <w:startOverride w:val="1"/>

</xml_diff>

<commit_message>
Patrol is keyboard only, no anomalies, no TRACK meter
The cursor is hidden while walking the hallway; it stays for the desk,
peeks and pause. The flashlight points the way the guard faces, so
walking left flips him and the beam. No anomalies roam the school
(patrolAnomalies in GameConfig is off). The TRACK meter is gone. One
token lies in the hallway each night now that nothing drops them.
Docs, controls sheet and GDD v2.2 updated.

Co-Authored-By: Claude Opus 5.5 <noreply@anthropic.com>
</commit_message>
<xml_diff>
--- a/docs/Show-Me-Your-ID-GDD.docx
+++ b/docs/Show-Me-Your-ID-GDD.docx
@@ -68,7 +68,7 @@
           <w:sz w:val="24"/>
           <w:szCs w:val="24"/>
         </w:rPr>
-        <w:t xml:space="preserve">Version 2.1</w:t>
+        <w:t xml:space="preserve">Version 2.2</w:t>
       </w:r>
     </w:p>
     <w:p>
@@ -906,7 +906,7 @@
         <w:rPr>
           <w:rFonts w:ascii="Calibri" w:cs="Calibri" w:eastAsia="Calibri" w:hAnsi="Calibri"/>
         </w:rPr>
-        <w:t xml:space="preserve">2.1</w:t>
+        <w:t xml:space="preserve">2.2</w:t>
       </w:r>
     </w:p>
     <w:p>
@@ -1341,6 +1341,95 @@
           </w:p>
         </w:tc>
       </w:tr>
+      <w:tr>
+        <w:tc>
+          <w:tcPr>
+            <w:tcW w:type="dxa" w:w="1400"/>
+            <w:tcBorders>
+              <w:top w:val="single" w:color="808080" w:sz="4"/>
+              <w:left w:val="single" w:color="808080" w:sz="4"/>
+              <w:bottom w:val="single" w:color="808080" w:sz="4"/>
+              <w:right w:val="single" w:color="808080" w:sz="4"/>
+            </w:tcBorders>
+            <w:tcMar>
+              <w:top w:type="dxa" w:w="60"/>
+              <w:left w:type="dxa" w:w="100"/>
+              <w:bottom w:type="dxa" w:w="60"/>
+              <w:right w:type="dxa" w:w="100"/>
+            </w:tcMar>
+          </w:tcPr>
+          <w:p>
+            <w:r>
+              <w:rPr>
+                <w:rFonts w:ascii="Calibri" w:cs="Calibri" w:eastAsia="Calibri" w:hAnsi="Calibri"/>
+                <w:b w:val="false"/>
+                <w:bCs w:val="false"/>
+                <w:sz w:val="20"/>
+                <w:szCs w:val="20"/>
+              </w:rPr>
+              <w:t xml:space="preserve">2.2</w:t>
+            </w:r>
+          </w:p>
+        </w:tc>
+        <w:tc>
+          <w:tcPr>
+            <w:tcW w:type="dxa" w:w="1900"/>
+            <w:tcBorders>
+              <w:top w:val="single" w:color="808080" w:sz="4"/>
+              <w:left w:val="single" w:color="808080" w:sz="4"/>
+              <w:bottom w:val="single" w:color="808080" w:sz="4"/>
+              <w:right w:val="single" w:color="808080" w:sz="4"/>
+            </w:tcBorders>
+            <w:tcMar>
+              <w:top w:type="dxa" w:w="60"/>
+              <w:left w:type="dxa" w:w="100"/>
+              <w:bottom w:type="dxa" w:w="60"/>
+              <w:right w:type="dxa" w:w="100"/>
+            </w:tcMar>
+          </w:tcPr>
+          <w:p>
+            <w:r>
+              <w:rPr>
+                <w:rFonts w:ascii="Calibri" w:cs="Calibri" w:eastAsia="Calibri" w:hAnsi="Calibri"/>
+                <w:b w:val="false"/>
+                <w:bCs w:val="false"/>
+                <w:sz w:val="20"/>
+                <w:szCs w:val="20"/>
+              </w:rPr>
+              <w:t xml:space="preserve">October 31, 2026</w:t>
+            </w:r>
+          </w:p>
+        </w:tc>
+        <w:tc>
+          <w:tcPr>
+            <w:tcW w:type="dxa" w:w="6060"/>
+            <w:tcBorders>
+              <w:top w:val="single" w:color="808080" w:sz="4"/>
+              <w:left w:val="single" w:color="808080" w:sz="4"/>
+              <w:bottom w:val="single" w:color="808080" w:sz="4"/>
+              <w:right w:val="single" w:color="808080" w:sz="4"/>
+            </w:tcBorders>
+            <w:tcMar>
+              <w:top w:type="dxa" w:w="60"/>
+              <w:left w:type="dxa" w:w="100"/>
+              <w:bottom w:type="dxa" w:w="60"/>
+              <w:right w:type="dxa" w:w="100"/>
+            </w:tcMar>
+          </w:tcPr>
+          <w:p>
+            <w:r>
+              <w:rPr>
+                <w:rFonts w:ascii="Calibri" w:cs="Calibri" w:eastAsia="Calibri" w:hAnsi="Calibri"/>
+                <w:b w:val="false"/>
+                <w:bCs w:val="false"/>
+                <w:sz w:val="20"/>
+                <w:szCs w:val="20"/>
+              </w:rPr>
+              <w:t xml:space="preserve">School map rebuilt from the desk map: Security, Room 101, Room 202, CR-1, sealed server room, CR-2. No roaming anomalies; anomalies only at the security window. Peek reworked as a black cover with a real hole. Patrol is keyboard only and the flashlight follows the guard's facing. TRACK meter removed. The hunt has no audio yet: captions carry the cues. He says he will be back and leaves after the refusal.</w:t>
+            </w:r>
+          </w:p>
+        </w:tc>
+      </w:tr>
     </w:tbl>
     <w:p>
       <w:pPr>
@@ -4907,7 +4996,7 @@
         <w:rPr>
           <w:rFonts w:ascii="Calibri" w:cs="Calibri" w:eastAsia="Calibri" w:hAnsi="Calibri"/>
         </w:rPr>
-        <w:t xml:space="preserve">F toggles a wide sweep beam, Q switches to a tight focus beam, L turns it off. It runs on a battery.</w:t>
+        <w:t xml:space="preserve">F toggles a wide sweep beam, Q switches to a tight focus beam, L turns it off. It points the way the guard faces: walking left flips him and the beam, walking right turns them back. Patrol has no cursor. The beam runs on a battery.</w:t>
       </w:r>
     </w:p>
     <w:p>
@@ -4925,13 +5014,13 @@
           <w:b/>
           <w:bCs/>
         </w:rPr>
-        <w:t xml:space="preserve">Roaming anomalies: </w:t>
-      </w:r>
-      <w:r>
-        <w:rPr>
-          <w:rFonts w:ascii="Calibri" w:cs="Calibri" w:eastAsia="Calibri" w:hAnsi="Calibri"/>
-        </w:rPr>
-        <w:t xml:space="preserve">They move through the hallway and classrooms by blinking, sliding, sprinting or hugging cover. Holding the focus beam on one fills a TRACK meter: roaming, stalking, detected, exposed, repelled. A repelled anomaly retreats, drops a token and may come back. Being caught costs sanity and moves the player, but never ends the run by itself.</w:t>
+        <w:t xml:space="preserve">No roaming anomalies: </w:t>
+      </w:r>
+      <w:r>
+        <w:rPr>
+          <w:rFonts w:ascii="Calibri" w:cs="Calibri" w:eastAsia="Calibri" w:hAnsi="Calibri"/>
+        </w:rPr>
+        <w:t xml:space="preserve">Anomalies only ever appear at the security window. On patrol the only threat is the administrator on night 5.</w:t>
       </w:r>
     </w:p>
     <w:p>
@@ -4955,7 +5044,7 @@
         <w:rPr>
           <w:rFonts w:ascii="Calibri" w:cs="Calibri" w:eastAsia="Calibri" w:hAnsi="Calibri"/>
         </w:rPr>
-        <w:t xml:space="preserve">Classroom 1, Classroom 2 and the comfort room are not entered. From the doorway the player moves a lamp cursor (F toggles it, Q switches wide or tight) that cuts a hole in the darkness, reveals clues and anomalies, and shows the room behind. The exit is the bottom edge or E at the doorway.</w:t>
+        <w:t xml:space="preserve">Classroom 1, Classroom 2 and the comfort room are not entered. From the doorway the player moves a lamp cursor (F toggles it, Q switches wide or tight) that cuts a real hole in a black cover and shows the room behind it. E selects only what the lit lamp is on. S or the bottom edge steps back.</w:t>
       </w:r>
     </w:p>
     <w:p>
@@ -4973,13 +5062,13 @@
           <w:b/>
           <w:bCs/>
         </w:rPr>
-        <w:t xml:space="preserve">Comfort room: </w:t>
-      </w:r>
-      <w:r>
-        <w:rPr>
-          <w:rFonts w:ascii="Calibri" w:cs="Calibri" w:eastAsia="Calibri" w:hAnsi="Calibri"/>
-        </w:rPr>
-        <w:t xml:space="preserve">A door at the east end of the hallway, next to the sealed server door, peeked into like the classrooms.</w:t>
+        <w:t xml:space="preserve">Comfort rooms: </w:t>
+      </w:r>
+      <w:r>
+        <w:rPr>
+          <w:rFonts w:ascii="Calibri" w:cs="Calibri" w:eastAsia="Calibri" w:hAnsi="Calibri"/>
+        </w:rPr>
+        <w:t xml:space="preserve">CR-1 and CR-2 stand either side of the sealed server door at the east end, peeked into like the classrooms.</w:t>
       </w:r>
     </w:p>
     <w:p>
@@ -5003,7 +5092,7 @@
         <w:rPr>
           <w:rFonts w:ascii="Calibri" w:cs="Calibri" w:eastAsia="Calibri" w:hAnsi="Calibri"/>
         </w:rPr>
-        <w:t xml:space="preserve">Besides the clues: the patrol clipboard, a dead light switch and two lockers in the hallway, and the mirror, sinks and stalls in the comfort room.</w:t>
+        <w:t xml:space="preserve">Besides the clues: the patrol clipboard, a dead light switch and two lockers in the hallway, and the mirror, sinks and stalls in the comfort rooms.</w:t>
       </w:r>
     </w:p>
     <w:p>
@@ -5027,7 +5116,7 @@
         <w:rPr>
           <w:rFonts w:ascii="Calibri" w:cs="Calibri" w:eastAsia="Calibri" w:hAnsi="Calibri"/>
         </w:rPr>
-        <w:t xml:space="preserve">Dropped by repelled anomalies and banked between runs. Three tokens open Endless and Challenge from the main menu.</w:t>
+        <w:t xml:space="preserve">One lies in the hallway on each of nights 1 to 4. They are banked between runs. Three tokens open Endless and Challenge from the main menu.</w:t>
       </w:r>
     </w:p>
     <w:p>
@@ -5085,7 +5174,7 @@
         <w:rPr>
           <w:rFonts w:ascii="Calibri" w:cs="Calibri" w:eastAsia="Calibri" w:hAnsi="Calibri"/>
         </w:rPr>
-        <w:t xml:space="preserve">After he is refused the night does not end. It plays like the Nightmare Fredbear night of Five Nights at Freddy's 4: he forces his way in and is the only threat in the building, and the player survives until dawn (210 seconds). Footsteps mean he is walking. When they stop he is in one of three places:</w:t>
+        <w:t xml:space="preserve">After he is refused he says he will be back and leaves the window, but the night does not end. It plays like the Nightmare Fredbear night of Five Nights at Freddy's 4: he forces his way in and is the only threat in the building, and the player survives until dawn (210 seconds). There is no audio yet, so captions say when he is walking and where he stops. He is then in one of three places:</w:t>
       </w:r>
     </w:p>
     <w:tbl>
@@ -5315,7 +5404,7 @@
                 <w:sz w:val="20"/>
                 <w:szCs w:val="20"/>
               </w:rPr>
-              <w:t xml:space="preserve">In the comfort room</w:t>
+              <w:t xml:space="preserve">In CR-1 or CR-2</w:t>
             </w:r>
           </w:p>
         </w:tc>
@@ -5462,7 +5551,7 @@
                 <w:sz w:val="20"/>
                 <w:szCs w:val="20"/>
               </w:rPr>
-              <w:t xml:space="preserve">Flash his face with the beam within 2.6 seconds</w:t>
+              <w:t xml:space="preserve">Turn to him and flash his face within 2.6 seconds</w:t>
             </w:r>
           </w:p>
         </w:tc>
@@ -5612,7 +5701,7 @@
         <w:rPr>
           <w:rFonts w:ascii="Calibri" w:cs="Calibri" w:eastAsia="Calibri" w:hAnsi="Calibri"/>
         </w:rPr>
-        <w:t xml:space="preserve">Roaming anomalies in the hallway and classrooms.</w:t>
+        <w:t xml:space="preserve">Document and answer inconsistencies.</w:t>
       </w:r>
     </w:p>
     <w:p>
@@ -5628,7 +5717,7 @@
         <w:rPr>
           <w:rFonts w:ascii="Calibri" w:cs="Calibri" w:eastAsia="Calibri" w:hAnsi="Calibri"/>
         </w:rPr>
-        <w:t xml:space="preserve">Document and answer inconsistencies.</w:t>
+        <w:t xml:space="preserve">The district administrator.</w:t>
       </w:r>
     </w:p>
     <w:p>
@@ -5644,23 +5733,7 @@
         <w:rPr>
           <w:rFonts w:ascii="Calibri" w:cs="Calibri" w:eastAsia="Calibri" w:hAnsi="Calibri"/>
         </w:rPr>
-        <w:t xml:space="preserve">The district administrator.</w:t>
-      </w:r>
-    </w:p>
-    <w:p>
-      <w:pPr>
-        <w:pStyle w:val="ListParagraph"/>
-        <w:numPr>
-          <w:ilvl w:val="0"/>
-          <w:numId w:val="2"/>
-        </w:numPr>
-        <w:spacing w:after="60"/>
-      </w:pPr>
-      <w:r>
-        <w:rPr>
-          <w:rFonts w:ascii="Calibri" w:cs="Calibri" w:eastAsia="Calibri" w:hAnsi="Calibri"/>
-        </w:rPr>
-        <w:t xml:space="preserve">Sanity loss from mistakes, scares and the dark.</w:t>
+        <w:t xml:space="preserve">Sanity loss from mistakes and scares.</w:t>
       </w:r>
     </w:p>
     <w:p>
@@ -6603,23 +6676,7 @@
         <w:rPr>
           <w:rFonts w:ascii="Calibri" w:cs="Calibri" w:eastAsia="Calibri" w:hAnsi="Calibri"/>
         </w:rPr>
-        <w:t xml:space="preserve">The dark hallway: a roaming anomaly can frighten the player away from the desk.</w:t>
-      </w:r>
-    </w:p>
-    <w:p>
-      <w:pPr>
-        <w:pStyle w:val="ListParagraph"/>
-        <w:numPr>
-          <w:ilvl w:val="0"/>
-          <w:numId w:val="7"/>
-        </w:numPr>
-        <w:spacing w:after="60"/>
-      </w:pPr>
-      <w:r>
-        <w:rPr>
-          <w:rFonts w:ascii="Calibri" w:cs="Calibri" w:eastAsia="Calibri" w:hAnsi="Calibri"/>
-        </w:rPr>
-        <w:t xml:space="preserve">The dark classroom: anomalies and clues are only seen under the lamp.</w:t>
+        <w:t xml:space="preserve">The dark classroom: clues are only seen under the lamp.</w:t>
       </w:r>
     </w:p>
     <w:p>
@@ -8783,7 +8840,7 @@
         <w:rPr>
           <w:rFonts w:ascii="Calibri" w:cs="Calibri" w:eastAsia="Calibri" w:hAnsi="Calibri"/>
         </w:rPr>
-        <w:t xml:space="preserve">A fixed security room for inspection, a side scrolling hallway for patrol, and three peek only rooms: two classrooms and a comfort room.</w:t>
+        <w:t xml:space="preserve">A fixed security room for inspection, a side scrolling hallway for patrol, and four peek only rooms: two classrooms and two comfort rooms. The hallway and both maps are built from one table.</w:t>
       </w:r>
     </w:p>
     <w:tbl>
@@ -9071,7 +9128,7 @@
                 <w:sz w:val="20"/>
                 <w:szCs w:val="20"/>
               </w:rPr>
-              <w:t xml:space="preserve">Two classroom doors, the security door at the west end, the comfort room door and the sealed server door at the east end, lockers, notice board, flyer, clock, clipboard, a dead switch.</w:t>
+              <w:t xml:space="preserve">In order from the west: the security door, Room 101, Room 202, CR-1, the sealed server door, CR-2, with lockers, notice board, flyer, clock, clipboard, a dead switch.</w:t>
             </w:r>
           </w:p>
         </w:tc>
@@ -9191,7 +9248,7 @@
                 <w:sz w:val="20"/>
                 <w:szCs w:val="20"/>
               </w:rPr>
-              <w:t xml:space="preserve">Comfort room</w:t>
+              <w:t xml:space="preserve">CR-1 and CR-2</w:t>
             </w:r>
           </w:p>
         </w:tc>
@@ -11017,7 +11074,7 @@
         <w:rPr>
           <w:rFonts w:ascii="Calibri" w:cs="Calibri" w:eastAsia="Calibri" w:hAnsi="Calibri"/>
         </w:rPr>
-        <w:t xml:space="preserve">The build generates placeholder sounds at runtime. Final recorded audio replaces them by dropping files with the same names into Resources/Audio.</w:t>
+        <w:t xml:space="preserve">No final audio exists yet. The night 5 hunt plays no sound and uses captions. Final recorded audio replaces the placeholder sounds by dropping files with the same names into Resources/Audio.</w:t>
       </w:r>
     </w:p>
     <w:p>
@@ -14744,7 +14801,7 @@
                 <w:sz w:val="20"/>
                 <w:szCs w:val="20"/>
               </w:rPr>
-              <w:t xml:space="preserve">Patrol: hallway, flashlight, roaming anomalies</w:t>
+              <w:t xml:space="preserve">Patrol: hallway and flashlight</w:t>
             </w:r>
           </w:p>
         </w:tc>
@@ -14802,7 +14859,7 @@
                 <w:sz w:val="20"/>
                 <w:szCs w:val="20"/>
               </w:rPr>
-              <w:t xml:space="preserve">Painted corridor uses the whole 30 unit painting; walkers stand on the painted floor</w:t>
+              <w:t xml:space="preserve">Keyboard only, no anomalies; follows the desk map</w:t>
             </w:r>
           </w:p>
         </w:tc>
@@ -14833,7 +14890,7 @@
                 <w:sz w:val="20"/>
                 <w:szCs w:val="20"/>
               </w:rPr>
-              <w:t xml:space="preserve">Peek lamp with a cursor hole in the dark</w:t>
+              <w:t xml:space="preserve">Peek lamp with a hole in the dark</w:t>
             </w:r>
           </w:p>
         </w:tc>
@@ -14891,7 +14948,7 @@
                 <w:sz w:val="20"/>
                 <w:szCs w:val="20"/>
               </w:rPr>
-              <w:t xml:space="preserve">Mask fix needs confirming in the editor</w:t>
+              <w:t xml:space="preserve">Black cover with a real hole; needs confirming in the editor</w:t>
             </w:r>
           </w:p>
         </w:tc>
@@ -14922,7 +14979,7 @@
                 <w:sz w:val="20"/>
                 <w:szCs w:val="20"/>
               </w:rPr>
-              <w:t xml:space="preserve">Comfort room</w:t>
+              <w:t xml:space="preserve">CR-1 and CR-2</w:t>
             </w:r>
           </w:p>
         </w:tc>
@@ -16937,7 +16994,7 @@
         <w:sz w:val="18"/>
         <w:szCs w:val="18"/>
       </w:rPr>
-      <w:t xml:space="preserve">Show Me Your ID! Game Design Document v2.1   Page </w:t>
+      <w:t xml:space="preserve">Show Me Your ID! Game Design Document v2.2   Page </w:t>
     </w:r>
     <w:r>
       <w:rPr>

</xml_diff>

<commit_message>
Patrol: mouse aims the flashlight, interaction goes by the body
The cursor stays on patrol and aims the beam; a lit beam turns the guard
to face it. The peek's prompt no longer stays on screen in the hallway.

Co-Authored-By: Claude Opus 5.5 <noreply@anthropic.com>
</commit_message>
<xml_diff>
--- a/docs/Show-Me-Your-ID-GDD.docx
+++ b/docs/Show-Me-Your-ID-GDD.docx
@@ -1425,7 +1425,7 @@
                 <w:sz w:val="20"/>
                 <w:szCs w:val="20"/>
               </w:rPr>
-              <w:t xml:space="preserve">School map rebuilt from the desk map: Security, Room 101, Room 202, CR-1, sealed server room, CR-2. No roaming anomalies; anomalies only at the security window. Peek reworked as a black cover with a real hole. Patrol is keyboard only and the flashlight follows the guard's facing. TRACK meter removed. The hunt has no audio yet: captions carry the cues. He says he will be back and leaves after the refusal.</w:t>
+              <w:t xml:space="preserve">School map rebuilt from the desk map: Security, Room 101, Room 202, CR-1, sealed server room, CR-2. No roaming anomalies; anomalies only at the security window. Peek reworked as a black cover with a real hole. On patrol the mouse only aims the flashlight; doors and items go by where the guard stands. TRACK meter removed. The hunt has no audio yet: captions carry the cues. He says he will be back and leaves after the refusal.</w:t>
             </w:r>
           </w:p>
         </w:tc>
@@ -4996,7 +4996,7 @@
         <w:rPr>
           <w:rFonts w:ascii="Calibri" w:cs="Calibri" w:eastAsia="Calibri" w:hAnsi="Calibri"/>
         </w:rPr>
-        <w:t xml:space="preserve">F toggles a wide sweep beam, Q switches to a tight focus beam, L turns it off. It points the way the guard faces: walking left flips him and the beam, walking right turns them back. Patrol has no cursor. The beam runs on a battery.</w:t>
+        <w:t xml:space="preserve">F toggles a wide sweep beam, Q switches to a tight focus beam, L turns it off. It points at the cursor. While lit it turns the guard to face it; while off he faces the way he walks. The cursor selects nothing on patrol: doors and items go by where the guard stands. The beam runs on a battery.</w:t>
       </w:r>
     </w:p>
     <w:p>
@@ -5551,7 +5551,7 @@
                 <w:sz w:val="20"/>
                 <w:szCs w:val="20"/>
               </w:rPr>
-              <w:t xml:space="preserve">Turn to him and flash his face within 2.6 seconds</w:t>
+              <w:t xml:space="preserve">Aim at him and flash his face within 2.6 seconds</w:t>
             </w:r>
           </w:p>
         </w:tc>
@@ -14859,7 +14859,7 @@
                 <w:sz w:val="20"/>
                 <w:szCs w:val="20"/>
               </w:rPr>
-              <w:t xml:space="preserve">Keyboard only, no anomalies; follows the desk map</w:t>
+              <w:t xml:space="preserve">Interaction by body, mouse aims the beam, no anomalies; follows the desk map</w:t>
             </w:r>
           </w:p>
         </w:tc>

</xml_diff>